<commit_message>
Update PV simulations and rebuild docs
Add serialized .RData and refreshed simulation outputs; update simulations Rmd, HTML, and .Rhistory with revised PV valuation, plotting, and regression code (including beta tweak and expanded elasticity calculations). Replace betas_saturated_model.xlsx, remove outdated sim.pdf, and update related documentation and manuscript (.docx) to reflect rebuilt results.
</commit_message>
<xml_diff>
--- a/Manuscript/research_paper.docx
+++ b/Manuscript/research_paper.docx
@@ -478,8 +478,6 @@
         </w:rPr>
         <w:t xml:space="preserve"> The result is the following set of contributions: </w:t>
       </w:r>
-      <w:bookmarkStart w:id="0" w:name="_GoBack"/>
-      <w:bookmarkEnd w:id="0"/>
     </w:p>
     <w:p>
       <w:pPr>
@@ -835,7 +833,7 @@
           <w:iCs/>
         </w:rPr>
       </w:pPr>
-      <w:bookmarkStart w:id="1" w:name="_Hlk225078139"/>
+      <w:bookmarkStart w:id="0" w:name="_Hlk225078139"/>
       <w:r>
         <w:rPr>
           <w:b/>
@@ -1326,7 +1324,7 @@
         <w:t>Own-calculations</w:t>
       </w:r>
     </w:p>
-    <w:bookmarkEnd w:id="1"/>
+    <w:bookmarkEnd w:id="0"/>
     <w:p>
       <w:pPr>
         <w:pStyle w:val="NormalWeb"/>
@@ -2526,7 +2524,7 @@
           <w:szCs w:val="24"/>
           <w14:ligatures w14:val="none"/>
         </w:rPr>
-        <w:t>Finally, allowing for country-specific dynamic effects yields similar patterns: post-treatment coefficients are consistently negative across EU countries, while pre-treatment estimates remain close to zero</w:t>
+        <w:t>Finally, allowing for country-specific dynamic effects yields similar patterns</w:t>
       </w:r>
       <w:r>
         <w:rPr>
@@ -2539,7 +2537,7 @@
           <w:szCs w:val="24"/>
           <w14:ligatures w14:val="none"/>
         </w:rPr>
-        <w:t xml:space="preserve"> (fig 4)</w:t>
+        <w:t xml:space="preserve"> as</w:t>
       </w:r>
       <w:r>
         <w:rPr>
@@ -2552,7 +2550,137 @@
           <w:szCs w:val="24"/>
           <w14:ligatures w14:val="none"/>
         </w:rPr>
-        <w:t xml:space="preserve">. This result allows for the saturated DID design and the estimation of the country specific elasticities. </w:t>
+        <w:t xml:space="preserve"> post-treatment coefficients are consistently negative across EU countries, while pre-treatment estimates remain close to zero</w:t>
+      </w:r>
+      <w:r>
+        <w:rPr>
+          <w:rFonts w:ascii="Times New Roman" w:eastAsia="Times New Roman" w:hAnsi="Times New Roman" w:cs="Times New Roman"/>
+          <w:i w:val="0"/>
+          <w:iCs w:val="0"/>
+          <w:color w:val="auto"/>
+          <w:kern w:val="0"/>
+          <w:sz w:val="24"/>
+          <w:szCs w:val="24"/>
+          <w14:ligatures w14:val="none"/>
+        </w:rPr>
+        <w:t xml:space="preserve"> (fig 4)</w:t>
+      </w:r>
+      <w:r>
+        <w:rPr>
+          <w:rFonts w:ascii="Times New Roman" w:eastAsia="Times New Roman" w:hAnsi="Times New Roman" w:cs="Times New Roman"/>
+          <w:i w:val="0"/>
+          <w:iCs w:val="0"/>
+          <w:color w:val="auto"/>
+          <w:kern w:val="0"/>
+          <w:sz w:val="24"/>
+          <w:szCs w:val="24"/>
+          <w14:ligatures w14:val="none"/>
+        </w:rPr>
+        <w:t xml:space="preserve">. </w:t>
+      </w:r>
+      <w:r>
+        <w:rPr>
+          <w:rFonts w:ascii="Times New Roman" w:eastAsia="Times New Roman" w:hAnsi="Times New Roman" w:cs="Times New Roman"/>
+          <w:i w:val="0"/>
+          <w:iCs w:val="0"/>
+          <w:color w:val="auto"/>
+          <w:kern w:val="0"/>
+          <w:sz w:val="24"/>
+          <w:szCs w:val="24"/>
+          <w14:ligatures w14:val="none"/>
+        </w:rPr>
+        <w:t>The only exception to this is the Portuguese case where the applications did not immediately collapse in 2021. This can be traced down to a UCAS data reporting problem, where i</w:t>
+      </w:r>
+      <w:r>
+        <w:rPr>
+          <w:rFonts w:ascii="Times New Roman" w:eastAsia="Times New Roman" w:hAnsi="Times New Roman" w:cs="Times New Roman"/>
+          <w:i w:val="0"/>
+          <w:iCs w:val="0"/>
+          <w:color w:val="auto"/>
+          <w:kern w:val="0"/>
+          <w:sz w:val="24"/>
+          <w:szCs w:val="24"/>
+          <w14:ligatures w14:val="none"/>
+        </w:rPr>
+        <w:t>n the 2021 cycle, some RPAs were mistakenly submitted as domiciled in Portugal, meaning that the true number of Portugal domiciled RPAs is lower than the reported number of Portugal domiciled RPAs for the 2021 cycle</w:t>
+      </w:r>
+      <w:r>
+        <w:rPr>
+          <w:rFonts w:ascii="Times New Roman" w:eastAsia="Times New Roman" w:hAnsi="Times New Roman" w:cs="Times New Roman"/>
+          <w:i w:val="0"/>
+          <w:iCs w:val="0"/>
+          <w:color w:val="auto"/>
+          <w:kern w:val="0"/>
+          <w:sz w:val="24"/>
+          <w:szCs w:val="24"/>
+          <w14:ligatures w14:val="none"/>
+        </w:rPr>
+        <w:t xml:space="preserve"> (</w:t>
+      </w:r>
+      <w:r>
+        <w:rPr>
+          <w:rFonts w:ascii="Times New Roman" w:eastAsia="Times New Roman" w:hAnsi="Times New Roman" w:cs="Times New Roman"/>
+          <w:i w:val="0"/>
+          <w:iCs w:val="0"/>
+          <w:color w:val="auto"/>
+          <w:kern w:val="0"/>
+          <w:sz w:val="24"/>
+          <w:szCs w:val="24"/>
+          <w14:ligatures w14:val="none"/>
+        </w:rPr>
+        <w:t>UCAS</w:t>
+      </w:r>
+      <w:r>
+        <w:rPr>
+          <w:rFonts w:ascii="Times New Roman" w:eastAsia="Times New Roman" w:hAnsi="Times New Roman" w:cs="Times New Roman"/>
+          <w:i w:val="0"/>
+          <w:iCs w:val="0"/>
+          <w:color w:val="auto"/>
+          <w:kern w:val="0"/>
+          <w:sz w:val="24"/>
+          <w:szCs w:val="24"/>
+          <w14:ligatures w14:val="none"/>
+        </w:rPr>
+        <w:t xml:space="preserve">, </w:t>
+      </w:r>
+      <w:r>
+        <w:rPr>
+          <w:rFonts w:ascii="Times New Roman" w:eastAsia="Times New Roman" w:hAnsi="Times New Roman" w:cs="Times New Roman"/>
+          <w:i w:val="0"/>
+          <w:iCs w:val="0"/>
+          <w:color w:val="auto"/>
+          <w:kern w:val="0"/>
+          <w:sz w:val="24"/>
+          <w:szCs w:val="24"/>
+          <w14:ligatures w14:val="none"/>
+        </w:rPr>
+        <w:t>2022).</w:t>
+      </w:r>
+      <w:r>
+        <w:rPr>
+          <w:rFonts w:ascii="Times New Roman" w:eastAsia="Times New Roman" w:hAnsi="Times New Roman" w:cs="Times New Roman"/>
+          <w:i w:val="0"/>
+          <w:iCs w:val="0"/>
+          <w:color w:val="auto"/>
+          <w:kern w:val="0"/>
+          <w:sz w:val="24"/>
+          <w:szCs w:val="24"/>
+          <w14:ligatures w14:val="none"/>
+        </w:rPr>
+        <w:t xml:space="preserve"> </w:t>
+      </w:r>
+      <w:r>
+        <w:rPr>
+          <w:rFonts w:ascii="Times New Roman" w:eastAsia="Times New Roman" w:hAnsi="Times New Roman" w:cs="Times New Roman"/>
+          <w:i w:val="0"/>
+          <w:iCs w:val="0"/>
+          <w:color w:val="auto"/>
+          <w:kern w:val="0"/>
+          <w:sz w:val="24"/>
+          <w:szCs w:val="24"/>
+          <w14:ligatures w14:val="none"/>
+        </w:rPr>
+        <w:t xml:space="preserve">This result allows for the saturated DID design and the estimation of the country specific elasticities. </w:t>
       </w:r>
     </w:p>
     <w:p/>
@@ -3169,7 +3297,7 @@
                         </m:ctrlPr>
                       </m:dPr>
                       <m:e>
-                        <w:bookmarkStart w:id="2" w:name="_Hlk223452261"/>
+                        <w:bookmarkStart w:id="1" w:name="_Hlk223452261"/>
                         <m:r>
                           <m:rPr>
                             <m:sty m:val="bi"/>
@@ -3208,7 +3336,7 @@
                             </m:r>
                           </m:e>
                         </m:d>
-                        <w:bookmarkEnd w:id="2"/>
+                        <w:bookmarkEnd w:id="1"/>
                         <m:r>
                           <w:rPr>
                             <w:rFonts w:ascii="Cambria Math" w:eastAsia="Times New Roman" w:hAnsi="Cambria Math" w:cs="Times New Roman"/>
@@ -7127,7 +7255,13 @@
         <w:jc w:val="both"/>
       </w:pPr>
       <w:r>
-        <w:t>This heterogeneity aligns closely with cross-country differences in income. Regressing the estimated country-specific responses on GDP per capita reveals a strong positive relationship: wealthier countries experience smaller declines in applications</w:t>
+        <w:t>This heterogeneity aligns closely with cross-country differences in income. Regressing the estimated country-specific responses on GDP per capita reveals a strong positive relationship</w:t>
+      </w:r>
+      <w:r>
+        <w:t xml:space="preserve"> where</w:t>
+      </w:r>
+      <w:r>
+        <w:t xml:space="preserve"> wealthier countries experience smaller declines in applications</w:t>
       </w:r>
       <w:r>
         <w:t xml:space="preserve"> (table 2)</w:t>
@@ -7136,14 +7270,25 @@
         <w:t xml:space="preserve">. </w:t>
       </w:r>
       <w:r>
-        <w:t>However, a</w:t>
-      </w:r>
-      <w:r>
-        <w:t xml:space="preserve">n important consideration is that the tuition reform altered not only nominal prices </w:t>
+        <w:t xml:space="preserve">The strong positive relationship between GDP per capita and demand elasticity emerges only </w:t>
       </w:r>
       <w:r>
         <w:lastRenderedPageBreak/>
-        <w:t>but also the availability of income-contingent loans. Because these loans effectively reduce the cost of education, their removal may have generated larger effective price increases for applicants from lower-income countries. In the discussion section, we account for this by adjusting elasticities using country-specific effective price changes. Details on the construction of elasticity measures and alternative definitions are provided in Appendix A.</w:t>
+        <w:t>when elasticities are estimated using fixed effects specifications. This reflects the ability of the TWFE estimator to isolate the causal impact of the Brexit-induced tuition shock by removing both country-specific baseline differences and common time shocks. In contrast, pooled estimates conflate treatment effects with cross-country heterogeneity in levels and trends, obscuring the underlying relationship. As a result, the GDP gradient disappears when identification is not enforced.</w:t>
+      </w:r>
+    </w:p>
+    <w:p>
+      <w:pPr>
+        <w:pStyle w:val="NormalWeb"/>
+        <w:spacing w:before="0" w:beforeAutospacing="0" w:after="0" w:afterAutospacing="0" w:line="360" w:lineRule="auto"/>
+        <w:ind w:firstLine="720"/>
+        <w:jc w:val="both"/>
+      </w:pPr>
+      <w:r>
+        <w:t>A</w:t>
+      </w:r>
+      <w:r>
+        <w:t>n important consideration is that the tuition reform altered not only nominal prices but also the availability of income-contingent loans. Because these loans effectively reduce the cost of education, their removal may have generated larger effective price increases for applicants from lower-income countries. In the discussion section, we account for this by adjusting elasticities using country-specific effective price changes. Details on the construction of elasticity measures and alternative definitions are provided in Appendix A.</w:t>
       </w:r>
     </w:p>
     <w:p>
@@ -7228,7 +7373,6 @@
       <w:tblGrid>
         <w:gridCol w:w="1498"/>
         <w:gridCol w:w="1337"/>
-        <w:gridCol w:w="1418"/>
         <w:gridCol w:w="1243"/>
       </w:tblGrid>
       <w:tr>
@@ -7254,7 +7398,7 @@
                 <w14:ligatures w14:val="none"/>
               </w:rPr>
             </w:pPr>
-            <w:bookmarkStart w:id="3" w:name="_Hlk224319154"/>
+            <w:bookmarkStart w:id="2" w:name="_Hlk224319154"/>
           </w:p>
         </w:tc>
         <w:tc>
@@ -7285,23 +7429,24 @@
                 <w:kern w:val="0"/>
                 <w14:ligatures w14:val="none"/>
               </w:rPr>
-              <w:t>TWFE</w:t>
+              <w:t>TWFE elasticities</w:t>
             </w:r>
             <w:r>
               <w:rPr>
+                <w:rStyle w:val="FootnoteReference"/>
                 <w:rFonts w:ascii="Times New Roman" w:eastAsia="Times New Roman" w:hAnsi="Times New Roman" w:cs="Times New Roman"/>
                 <w:b/>
                 <w:i/>
                 <w:kern w:val="0"/>
                 <w14:ligatures w14:val="none"/>
               </w:rPr>
-              <w:t xml:space="preserve"> elasticities</w:t>
+              <w:footnoteReference w:id="1"/>
             </w:r>
           </w:p>
         </w:tc>
         <w:tc>
           <w:tcPr>
-            <w:tcW w:w="1418" w:type="dxa"/>
+            <w:tcW w:w="1243" w:type="dxa"/>
             <w:tcBorders>
               <w:top w:val="single" w:sz="4" w:space="0" w:color="auto"/>
             </w:tcBorders>
@@ -7327,59 +7472,7 @@
                 <w:kern w:val="0"/>
                 <w14:ligatures w14:val="none"/>
               </w:rPr>
-              <w:t>OWFE</w:t>
-            </w:r>
-            <w:r>
-              <w:rPr>
-                <w:rFonts w:ascii="Times New Roman" w:eastAsia="Times New Roman" w:hAnsi="Times New Roman" w:cs="Times New Roman"/>
-                <w:b/>
-                <w:i/>
-                <w:kern w:val="0"/>
-                <w14:ligatures w14:val="none"/>
-              </w:rPr>
-              <w:t xml:space="preserve"> elasticities</w:t>
-            </w:r>
-          </w:p>
-        </w:tc>
-        <w:tc>
-          <w:tcPr>
-            <w:tcW w:w="1134" w:type="dxa"/>
-            <w:tcBorders>
-              <w:top w:val="single" w:sz="4" w:space="0" w:color="auto"/>
-            </w:tcBorders>
-            <w:vAlign w:val="bottom"/>
-          </w:tcPr>
-          <w:p>
-            <w:pPr>
-              <w:spacing w:before="100" w:beforeAutospacing="1"/>
-              <w:jc w:val="center"/>
-              <w:rPr>
-                <w:rFonts w:ascii="Times New Roman" w:eastAsia="Times New Roman" w:hAnsi="Times New Roman" w:cs="Times New Roman"/>
-                <w:b/>
-                <w:i/>
-                <w:kern w:val="0"/>
-                <w14:ligatures w14:val="none"/>
-              </w:rPr>
-            </w:pPr>
-            <w:r>
-              <w:rPr>
-                <w:rFonts w:ascii="Times New Roman" w:eastAsia="Times New Roman" w:hAnsi="Times New Roman" w:cs="Times New Roman"/>
-                <w:b/>
-                <w:i/>
-                <w:kern w:val="0"/>
-                <w14:ligatures w14:val="none"/>
-              </w:rPr>
-              <w:t>Pool</w:t>
-            </w:r>
-            <w:r>
-              <w:rPr>
-                <w:rFonts w:ascii="Times New Roman" w:eastAsia="Times New Roman" w:hAnsi="Times New Roman" w:cs="Times New Roman"/>
-                <w:b/>
-                <w:i/>
-                <w:kern w:val="0"/>
-                <w14:ligatures w14:val="none"/>
-              </w:rPr>
-              <w:t>ed elasticities</w:t>
+              <w:t>Pooled elasticities</w:t>
             </w:r>
           </w:p>
         </w:tc>
@@ -7491,29 +7584,13 @@
                 <w:kern w:val="0"/>
                 <w14:ligatures w14:val="none"/>
               </w:rPr>
-              <w:t>1.1</w:t>
+              <w:t>1.11***</w:t>
             </w:r>
-            <w:r>
-              <w:rPr>
-                <w:rFonts w:ascii="Times New Roman" w:eastAsia="Times New Roman" w:hAnsi="Times New Roman" w:cs="Times New Roman"/>
-                <w:kern w:val="0"/>
-                <w14:ligatures w14:val="none"/>
-              </w:rPr>
-              <w:t>1</w:t>
-            </w:r>
-            <w:r>
-              <w:rPr>
-                <w:rFonts w:ascii="Times New Roman" w:eastAsia="Times New Roman" w:hAnsi="Times New Roman" w:cs="Times New Roman"/>
-                <w:kern w:val="0"/>
-                <w14:ligatures w14:val="none"/>
-              </w:rPr>
-              <w:t>***</w:t>
-            </w:r>
-          </w:p>
-        </w:tc>
-        <w:tc>
-          <w:tcPr>
-            <w:tcW w:w="1418" w:type="dxa"/>
+          </w:p>
+        </w:tc>
+        <w:tc>
+          <w:tcPr>
+            <w:tcW w:w="1243" w:type="dxa"/>
             <w:tcBorders>
               <w:top w:val="single" w:sz="4" w:space="0" w:color="auto"/>
             </w:tcBorders>
@@ -7528,25 +7605,14 @@
                 <w14:ligatures w14:val="none"/>
               </w:rPr>
             </w:pPr>
-          </w:p>
-        </w:tc>
-        <w:tc>
-          <w:tcPr>
-            <w:tcW w:w="1134" w:type="dxa"/>
-            <w:tcBorders>
-              <w:top w:val="single" w:sz="4" w:space="0" w:color="auto"/>
-            </w:tcBorders>
-          </w:tcPr>
-          <w:p>
-            <w:pPr>
-              <w:spacing w:before="100" w:beforeAutospacing="1" w:line="360" w:lineRule="auto"/>
-              <w:jc w:val="center"/>
-              <w:rPr>
-                <w:rFonts w:ascii="Times New Roman" w:eastAsia="Times New Roman" w:hAnsi="Times New Roman" w:cs="Times New Roman"/>
-                <w:kern w:val="0"/>
-                <w14:ligatures w14:val="none"/>
-              </w:rPr>
-            </w:pPr>
+            <w:r>
+              <w:rPr>
+                <w:rFonts w:ascii="Times New Roman" w:eastAsia="Times New Roman" w:hAnsi="Times New Roman" w:cs="Times New Roman"/>
+                <w:kern w:val="0"/>
+                <w14:ligatures w14:val="none"/>
+              </w:rPr>
+              <w:t>0.076</w:t>
+            </w:r>
           </w:p>
         </w:tc>
       </w:tr>
@@ -7596,7 +7662,7 @@
         </w:tc>
         <w:tc>
           <w:tcPr>
-            <w:tcW w:w="1418" w:type="dxa"/>
+            <w:tcW w:w="1243" w:type="dxa"/>
           </w:tcPr>
           <w:p>
             <w:pPr>
@@ -7608,22 +7674,14 @@
                 <w14:ligatures w14:val="none"/>
               </w:rPr>
             </w:pPr>
-          </w:p>
-        </w:tc>
-        <w:tc>
-          <w:tcPr>
-            <w:tcW w:w="1134" w:type="dxa"/>
-          </w:tcPr>
-          <w:p>
-            <w:pPr>
-              <w:spacing w:before="100" w:beforeAutospacing="1" w:line="360" w:lineRule="auto"/>
-              <w:jc w:val="center"/>
-              <w:rPr>
-                <w:rFonts w:ascii="Times New Roman" w:eastAsia="Times New Roman" w:hAnsi="Times New Roman" w:cs="Times New Roman"/>
-                <w:kern w:val="0"/>
-                <w14:ligatures w14:val="none"/>
-              </w:rPr>
-            </w:pPr>
+            <w:r>
+              <w:rPr>
+                <w:rFonts w:ascii="Times New Roman" w:eastAsia="Times New Roman" w:hAnsi="Times New Roman" w:cs="Times New Roman"/>
+                <w:kern w:val="0"/>
+                <w14:ligatures w14:val="none"/>
+              </w:rPr>
+              <w:t>(0.987)</w:t>
+            </w:r>
           </w:p>
         </w:tc>
       </w:tr>
@@ -7682,7 +7740,7 @@
         </w:tc>
         <w:tc>
           <w:tcPr>
-            <w:tcW w:w="1418" w:type="dxa"/>
+            <w:tcW w:w="1243" w:type="dxa"/>
           </w:tcPr>
           <w:p>
             <w:pPr>
@@ -7694,22 +7752,14 @@
                 <w14:ligatures w14:val="none"/>
               </w:rPr>
             </w:pPr>
-          </w:p>
-        </w:tc>
-        <w:tc>
-          <w:tcPr>
-            <w:tcW w:w="1134" w:type="dxa"/>
-          </w:tcPr>
-          <w:p>
-            <w:pPr>
-              <w:spacing w:before="100" w:beforeAutospacing="1" w:line="360" w:lineRule="auto"/>
-              <w:jc w:val="center"/>
-              <w:rPr>
-                <w:rFonts w:ascii="Times New Roman" w:eastAsia="Times New Roman" w:hAnsi="Times New Roman" w:cs="Times New Roman"/>
-                <w:kern w:val="0"/>
-                <w14:ligatures w14:val="none"/>
-              </w:rPr>
-            </w:pPr>
+            <w:r>
+              <w:rPr>
+                <w:rFonts w:ascii="Times New Roman" w:eastAsia="Times New Roman" w:hAnsi="Times New Roman" w:cs="Times New Roman"/>
+                <w:kern w:val="0"/>
+                <w14:ligatures w14:val="none"/>
+              </w:rPr>
+              <w:t>-1.87</w:t>
+            </w:r>
           </w:p>
         </w:tc>
       </w:tr>
@@ -7765,7 +7815,7 @@
         </w:tc>
         <w:tc>
           <w:tcPr>
-            <w:tcW w:w="1418" w:type="dxa"/>
+            <w:tcW w:w="1243" w:type="dxa"/>
             <w:tcBorders>
               <w:bottom w:val="single" w:sz="4" w:space="0" w:color="auto"/>
             </w:tcBorders>
@@ -7780,25 +7830,14 @@
                 <w14:ligatures w14:val="none"/>
               </w:rPr>
             </w:pPr>
-          </w:p>
-        </w:tc>
-        <w:tc>
-          <w:tcPr>
-            <w:tcW w:w="1134" w:type="dxa"/>
-            <w:tcBorders>
-              <w:bottom w:val="single" w:sz="4" w:space="0" w:color="auto"/>
-            </w:tcBorders>
-          </w:tcPr>
-          <w:p>
-            <w:pPr>
-              <w:spacing w:before="100" w:beforeAutospacing="1" w:line="360" w:lineRule="auto"/>
-              <w:jc w:val="center"/>
-              <w:rPr>
-                <w:rFonts w:ascii="Times New Roman" w:eastAsia="Times New Roman" w:hAnsi="Times New Roman" w:cs="Times New Roman"/>
-                <w:kern w:val="0"/>
-                <w14:ligatures w14:val="none"/>
-              </w:rPr>
-            </w:pPr>
+            <w:r>
+              <w:rPr>
+                <w:rFonts w:ascii="Times New Roman" w:eastAsia="Times New Roman" w:hAnsi="Times New Roman" w:cs="Times New Roman"/>
+                <w:kern w:val="0"/>
+                <w14:ligatures w14:val="none"/>
+              </w:rPr>
+              <w:t>(10.69)</w:t>
+            </w:r>
           </w:p>
         </w:tc>
       </w:tr>
@@ -7861,34 +7900,7 @@
         </w:tc>
         <w:tc>
           <w:tcPr>
-            <w:tcW w:w="1418" w:type="dxa"/>
-            <w:tcBorders>
-              <w:top w:val="single" w:sz="4" w:space="0" w:color="auto"/>
-            </w:tcBorders>
-          </w:tcPr>
-          <w:p>
-            <w:pPr>
-              <w:spacing w:before="100" w:beforeAutospacing="1" w:line="360" w:lineRule="auto"/>
-              <w:jc w:val="center"/>
-              <w:rPr>
-                <w:rFonts w:ascii="Times New Roman" w:eastAsia="Times New Roman" w:hAnsi="Times New Roman" w:cs="Times New Roman"/>
-                <w:kern w:val="0"/>
-                <w14:ligatures w14:val="none"/>
-              </w:rPr>
-            </w:pPr>
-            <w:r>
-              <w:rPr>
-                <w:rFonts w:ascii="Times New Roman" w:eastAsia="Times New Roman" w:hAnsi="Times New Roman" w:cs="Times New Roman"/>
-                <w:kern w:val="0"/>
-                <w14:ligatures w14:val="none"/>
-              </w:rPr>
-              <w:t>24</w:t>
-            </w:r>
-          </w:p>
-        </w:tc>
-        <w:tc>
-          <w:tcPr>
-            <w:tcW w:w="1134" w:type="dxa"/>
+            <w:tcW w:w="1243" w:type="dxa"/>
             <w:tcBorders>
               <w:top w:val="single" w:sz="4" w:space="0" w:color="auto"/>
             </w:tcBorders>
@@ -7942,6 +7954,15 @@
                 <w:kern w:val="0"/>
                 <w14:ligatures w14:val="none"/>
               </w:rPr>
+              <w:t xml:space="preserve">Adj. </w:t>
+            </w:r>
+            <w:r>
+              <w:rPr>
+                <w:rFonts w:ascii="Times New Roman" w:eastAsia="Times New Roman" w:hAnsi="Times New Roman" w:cs="Times New Roman"/>
+                <w:i/>
+                <w:kern w:val="0"/>
+                <w14:ligatures w14:val="none"/>
+              </w:rPr>
               <w:t>R</w:t>
             </w:r>
             <w:r>
@@ -7985,7 +8006,7 @@
         </w:tc>
         <w:tc>
           <w:tcPr>
-            <w:tcW w:w="1418" w:type="dxa"/>
+            <w:tcW w:w="1243" w:type="dxa"/>
             <w:tcBorders>
               <w:bottom w:val="single" w:sz="4" w:space="0" w:color="auto"/>
             </w:tcBorders>
@@ -8000,30 +8021,19 @@
                 <w14:ligatures w14:val="none"/>
               </w:rPr>
             </w:pPr>
-          </w:p>
-        </w:tc>
-        <w:tc>
-          <w:tcPr>
-            <w:tcW w:w="1134" w:type="dxa"/>
-            <w:tcBorders>
-              <w:bottom w:val="single" w:sz="4" w:space="0" w:color="auto"/>
-            </w:tcBorders>
-          </w:tcPr>
-          <w:p>
-            <w:pPr>
-              <w:spacing w:before="100" w:beforeAutospacing="1" w:line="360" w:lineRule="auto"/>
-              <w:jc w:val="center"/>
-              <w:rPr>
-                <w:rFonts w:ascii="Times New Roman" w:eastAsia="Times New Roman" w:hAnsi="Times New Roman" w:cs="Times New Roman"/>
-                <w:kern w:val="0"/>
-                <w14:ligatures w14:val="none"/>
-              </w:rPr>
-            </w:pPr>
+            <w:r>
+              <w:rPr>
+                <w:rFonts w:ascii="Times New Roman" w:eastAsia="Times New Roman" w:hAnsi="Times New Roman" w:cs="Times New Roman"/>
+                <w:kern w:val="0"/>
+                <w14:ligatures w14:val="none"/>
+              </w:rPr>
+              <w:t>-0.045</w:t>
+            </w:r>
           </w:p>
         </w:tc>
       </w:tr>
     </w:tbl>
-    <w:bookmarkEnd w:id="3"/>
+    <w:bookmarkEnd w:id="2"/>
     <w:p>
       <w:pPr>
         <w:pStyle w:val="NormalWeb"/>
@@ -8142,6 +8152,7 @@
           <w:b/>
           <w:color w:val="000000" w:themeColor="text1"/>
         </w:rPr>
+        <w:lastRenderedPageBreak/>
         <w:t xml:space="preserve">Figure </w:t>
       </w:r>
       <w:r>
@@ -8240,11 +8251,7 @@
         <w:t xml:space="preserve">It is also important to mention that </w:t>
       </w:r>
       <w:r>
-        <w:t xml:space="preserve">for nearly all EU origin countries, the persistent post-COVID elasticities remain strongly negative and closely aligned with the initial post-2021 </w:t>
-      </w:r>
-      <w:r>
-        <w:lastRenderedPageBreak/>
-        <w:t>estimates</w:t>
+        <w:t>for nearly all EU origin countries, the persistent post-COVID elasticities remain strongly negative and closely aligned with the initial post-2021 estimates</w:t>
       </w:r>
       <w:r>
         <w:t>. The</w:t>
@@ -11029,15 +11036,7 @@
           <w:rStyle w:val="Strong"/>
           <w:b w:val="0"/>
         </w:rPr>
-        <w:t xml:space="preserve">At the same time, there is clear evidence of heterogeneity. The interaction between the Brexit treatment and GDP per capita is positive and statistically </w:t>
-      </w:r>
-      <w:r>
-        <w:rPr>
-          <w:rStyle w:val="Strong"/>
-          <w:b w:val="0"/>
-        </w:rPr>
-        <w:lastRenderedPageBreak/>
-        <w:t>significant, indicating that higher-income countries experience smaller declines in applications. This is consistent with lower price sensitivity in wealthier contexts.</w:t>
+        <w:t>At the same time, there is clear evidence of heterogeneity. The interaction between the Brexit treatment and GDP per capita is positive and statistically significant, indicating that higher-income countries experience smaller declines in applications. This is consistent with lower price sensitivity in wealthier contexts.</w:t>
       </w:r>
     </w:p>
     <w:p>
@@ -11096,6 +11095,7 @@
           <w:kern w:val="0"/>
           <w14:ligatures w14:val="none"/>
         </w:rPr>
+        <w:lastRenderedPageBreak/>
         <w:drawing>
           <wp:inline distT="0" distB="0" distL="0" distR="0" wp14:anchorId="11E373C7" wp14:editId="48A98714">
             <wp:extent cx="5731510" cy="3502660"/>
@@ -11191,11 +11191,7 @@
         <w:t xml:space="preserve"> as well as the Poisson, MLE-based regression estimates (</w:t>
       </w:r>
       <w:r>
-        <w:t xml:space="preserve">see Berge (2018)). </w:t>
-      </w:r>
-      <w:r>
-        <w:lastRenderedPageBreak/>
-        <w:t>The resulting estimates are very close to the baseline results, and event-study diagnostics continue to show no evidence of differential pre-trends.</w:t>
+        <w:t>see Berge (2018)). The resulting estimates are very close to the baseline results, and event-study diagnostics continue to show no evidence of differential pre-trends.</w:t>
       </w:r>
     </w:p>
     <w:p>
@@ -11275,1118 +11271,1061 @@
     </w:p>
     <w:tbl>
       <w:tblPr>
-        <w:tblStyle w:val="TableGrid"/>
-        <w:tblW w:w="0" w:type="auto"/>
+        <w:tblW w:w="5180" w:type="dxa"/>
         <w:jc w:val="center"/>
         <w:tblBorders>
-          <w:top w:val="none" w:sz="0" w:space="0" w:color="auto"/>
-          <w:left w:val="none" w:sz="0" w:space="0" w:color="auto"/>
-          <w:bottom w:val="none" w:sz="0" w:space="0" w:color="auto"/>
-          <w:right w:val="none" w:sz="0" w:space="0" w:color="auto"/>
-          <w:insideH w:val="none" w:sz="0" w:space="0" w:color="auto"/>
-          <w:insideV w:val="none" w:sz="0" w:space="0" w:color="auto"/>
+          <w:top w:val="single" w:sz="4" w:space="0" w:color="auto"/>
+          <w:left w:val="single" w:sz="4" w:space="0" w:color="auto"/>
+          <w:bottom w:val="single" w:sz="4" w:space="0" w:color="auto"/>
+          <w:right w:val="single" w:sz="4" w:space="0" w:color="auto"/>
+          <w:insideH w:val="single" w:sz="4" w:space="0" w:color="auto"/>
+          <w:insideV w:val="single" w:sz="4" w:space="0" w:color="auto"/>
         </w:tblBorders>
         <w:tblLook w:val="04A0" w:firstRow="1" w:lastRow="0" w:firstColumn="1" w:lastColumn="0" w:noHBand="0" w:noVBand="1"/>
       </w:tblPr>
       <w:tblGrid>
-        <w:gridCol w:w="1617"/>
-        <w:gridCol w:w="1523"/>
-        <w:gridCol w:w="1312"/>
-        <w:gridCol w:w="1312"/>
-        <w:gridCol w:w="1672"/>
-        <w:gridCol w:w="1590"/>
+        <w:gridCol w:w="1129"/>
+        <w:gridCol w:w="1276"/>
+        <w:gridCol w:w="1418"/>
+        <w:gridCol w:w="1357"/>
       </w:tblGrid>
       <w:tr>
         <w:trPr>
-          <w:gridAfter w:val="2"/>
-          <w:wAfter w:w="3262" w:type="dxa"/>
+          <w:trHeight w:val="304"/>
           <w:jc w:val="center"/>
         </w:trPr>
         <w:tc>
           <w:tcPr>
-            <w:tcW w:w="1617" w:type="dxa"/>
-            <w:tcBorders>
-              <w:top w:val="single" w:sz="4" w:space="0" w:color="auto"/>
-              <w:bottom w:val="single" w:sz="4" w:space="0" w:color="auto"/>
-            </w:tcBorders>
-          </w:tcPr>
-          <w:p>
-            <w:pPr>
-              <w:jc w:val="both"/>
-              <w:rPr>
-                <w:rFonts w:ascii="Times New Roman" w:hAnsi="Times New Roman" w:cs="Times New Roman"/>
-                <w:i/>
-                <w:noProof/>
+            <w:tcW w:w="1129" w:type="dxa"/>
+            <w:shd w:val="clear" w:color="auto" w:fill="auto"/>
+            <w:vAlign w:val="center"/>
+            <w:hideMark/>
+          </w:tcPr>
+          <w:p>
+            <w:pPr>
+              <w:rPr>
+                <w:rFonts w:ascii="Times New Roman" w:eastAsia="Times New Roman" w:hAnsi="Times New Roman" w:cs="Times New Roman"/>
+                <w:kern w:val="0"/>
+                <w14:ligatures w14:val="none"/>
+              </w:rPr>
+            </w:pPr>
+          </w:p>
+        </w:tc>
+        <w:tc>
+          <w:tcPr>
+            <w:tcW w:w="1276" w:type="dxa"/>
+            <w:shd w:val="clear" w:color="auto" w:fill="auto"/>
+            <w:vAlign w:val="center"/>
+            <w:hideMark/>
+          </w:tcPr>
+          <w:p>
+            <w:pPr>
+              <w:jc w:val="center"/>
+              <w:rPr>
+                <w:rFonts w:ascii="Calibri" w:eastAsia="Times New Roman" w:hAnsi="Calibri" w:cs="Calibri"/>
+                <w:b/>
+                <w:bCs/>
+                <w:color w:val="000000"/>
+                <w:kern w:val="0"/>
+                <w:sz w:val="22"/>
+                <w:szCs w:val="22"/>
+                <w14:ligatures w14:val="none"/>
               </w:rPr>
             </w:pPr>
             <w:r>
               <w:rPr>
-                <w:rFonts w:ascii="Times New Roman" w:hAnsi="Times New Roman" w:cs="Times New Roman"/>
-                <w:i/>
-                <w:noProof/>
-              </w:rPr>
-              <w:t>Estimator</w:t>
+                <w:rFonts w:ascii="Calibri" w:eastAsia="Times New Roman" w:hAnsi="Calibri" w:cs="Calibri"/>
+                <w:b/>
+                <w:bCs/>
+                <w:color w:val="000000"/>
+                <w:kern w:val="0"/>
+                <w:sz w:val="22"/>
+                <w:szCs w:val="22"/>
+                <w14:ligatures w14:val="none"/>
+              </w:rPr>
+              <w:t>(1) Doubly Robust</w:t>
             </w:r>
           </w:p>
         </w:tc>
         <w:tc>
           <w:tcPr>
-            <w:tcW w:w="1523" w:type="dxa"/>
-            <w:tcBorders>
-              <w:top w:val="single" w:sz="4" w:space="0" w:color="auto"/>
-              <w:bottom w:val="single" w:sz="4" w:space="0" w:color="auto"/>
-            </w:tcBorders>
+            <w:tcW w:w="1418" w:type="dxa"/>
+            <w:shd w:val="clear" w:color="auto" w:fill="auto"/>
             <w:vAlign w:val="center"/>
+            <w:hideMark/>
           </w:tcPr>
           <w:p>
             <w:pPr>
               <w:jc w:val="center"/>
               <w:rPr>
-                <w:rFonts w:ascii="Times New Roman" w:hAnsi="Times New Roman" w:cs="Times New Roman"/>
+                <w:rFonts w:ascii="Calibri" w:eastAsia="Times New Roman" w:hAnsi="Calibri" w:cs="Calibri"/>
                 <w:b/>
-                <w:noProof/>
+                <w:bCs/>
+                <w:color w:val="000000"/>
+                <w:kern w:val="0"/>
+                <w:sz w:val="22"/>
+                <w:szCs w:val="22"/>
+                <w14:ligatures w14:val="none"/>
               </w:rPr>
             </w:pPr>
             <w:r>
               <w:rPr>
-                <w:rFonts w:ascii="Times New Roman" w:hAnsi="Times New Roman" w:cs="Times New Roman"/>
+                <w:rFonts w:ascii="Calibri" w:eastAsia="Times New Roman" w:hAnsi="Calibri" w:cs="Calibri"/>
                 <w:b/>
-                <w:noProof/>
-              </w:rPr>
-              <w:t>Doubly Robust</w:t>
+                <w:bCs/>
+                <w:color w:val="000000"/>
+                <w:kern w:val="0"/>
+                <w:sz w:val="22"/>
+                <w:szCs w:val="22"/>
+                <w14:ligatures w14:val="none"/>
+              </w:rPr>
+              <w:t>(2) TWFE</w:t>
             </w:r>
           </w:p>
         </w:tc>
         <w:tc>
           <w:tcPr>
-            <w:tcW w:w="1312" w:type="dxa"/>
-            <w:tcBorders>
-              <w:top w:val="single" w:sz="4" w:space="0" w:color="auto"/>
-              <w:bottom w:val="single" w:sz="4" w:space="0" w:color="auto"/>
-            </w:tcBorders>
+            <w:tcW w:w="1357" w:type="dxa"/>
+            <w:shd w:val="clear" w:color="auto" w:fill="auto"/>
             <w:vAlign w:val="center"/>
+            <w:hideMark/>
           </w:tcPr>
           <w:p>
             <w:pPr>
               <w:jc w:val="center"/>
               <w:rPr>
-                <w:rFonts w:ascii="Times New Roman" w:hAnsi="Times New Roman" w:cs="Times New Roman"/>
+                <w:rFonts w:ascii="Calibri" w:eastAsia="Times New Roman" w:hAnsi="Calibri" w:cs="Calibri"/>
                 <w:b/>
-                <w:noProof/>
+                <w:bCs/>
+                <w:color w:val="000000"/>
+                <w:kern w:val="0"/>
+                <w:sz w:val="22"/>
+                <w:szCs w:val="22"/>
+                <w14:ligatures w14:val="none"/>
               </w:rPr>
             </w:pPr>
             <w:r>
               <w:rPr>
-                <w:rFonts w:ascii="Times New Roman" w:hAnsi="Times New Roman" w:cs="Times New Roman"/>
+                <w:rFonts w:ascii="Calibri" w:eastAsia="Times New Roman" w:hAnsi="Calibri" w:cs="Calibri"/>
                 <w:b/>
-                <w:noProof/>
-              </w:rPr>
-              <w:t>TWFE</w:t>
-            </w:r>
-          </w:p>
-        </w:tc>
-        <w:tc>
-          <w:tcPr>
-            <w:tcW w:w="1312" w:type="dxa"/>
-            <w:tcBorders>
-              <w:top w:val="single" w:sz="4" w:space="0" w:color="auto"/>
-              <w:bottom w:val="single" w:sz="4" w:space="0" w:color="auto"/>
-            </w:tcBorders>
-          </w:tcPr>
-          <w:p>
-            <w:pPr>
-              <w:jc w:val="center"/>
-              <w:rPr>
-                <w:rFonts w:ascii="Times New Roman" w:hAnsi="Times New Roman" w:cs="Times New Roman"/>
-                <w:b/>
-                <w:noProof/>
-              </w:rPr>
-            </w:pPr>
-            <w:r>
-              <w:rPr>
-                <w:rFonts w:ascii="Times New Roman" w:hAnsi="Times New Roman" w:cs="Times New Roman"/>
-                <w:b/>
-                <w:noProof/>
-              </w:rPr>
-              <w:t>MLE – Poisson</w:t>
+                <w:bCs/>
+                <w:color w:val="000000"/>
+                <w:kern w:val="0"/>
+                <w:sz w:val="22"/>
+                <w:szCs w:val="22"/>
+                <w14:ligatures w14:val="none"/>
+              </w:rPr>
+              <w:t>(3) Poisson MLE</w:t>
             </w:r>
           </w:p>
         </w:tc>
       </w:tr>
       <w:tr>
         <w:trPr>
-          <w:gridAfter w:val="2"/>
-          <w:wAfter w:w="3262" w:type="dxa"/>
+          <w:trHeight w:val="147"/>
           <w:jc w:val="center"/>
         </w:trPr>
         <w:tc>
           <w:tcPr>
-            <w:tcW w:w="1617" w:type="dxa"/>
-            <w:tcBorders>
-              <w:top w:val="single" w:sz="4" w:space="0" w:color="auto"/>
-            </w:tcBorders>
-          </w:tcPr>
-          <w:p>
-            <w:pPr>
-              <w:jc w:val="both"/>
-              <w:rPr>
-                <w:rFonts w:ascii="Times New Roman" w:hAnsi="Times New Roman" w:cs="Times New Roman"/>
-                <w:noProof/>
+            <w:tcW w:w="5180" w:type="dxa"/>
+            <w:gridSpan w:val="4"/>
+            <w:shd w:val="clear" w:color="auto" w:fill="auto"/>
+            <w:vAlign w:val="center"/>
+            <w:hideMark/>
+          </w:tcPr>
+          <w:p>
+            <w:pPr>
+              <w:jc w:val="center"/>
+              <w:rPr>
+                <w:rFonts w:ascii="Calibri" w:eastAsia="Times New Roman" w:hAnsi="Calibri" w:cs="Calibri"/>
+                <w:b/>
+                <w:bCs/>
+                <w:i/>
+                <w:color w:val="000000"/>
+                <w:kern w:val="0"/>
+                <w:sz w:val="22"/>
+                <w:szCs w:val="22"/>
+                <w14:ligatures w14:val="none"/>
               </w:rPr>
             </w:pPr>
             <w:r>
               <w:rPr>
-                <w:rFonts w:ascii="Times New Roman" w:hAnsi="Times New Roman" w:cs="Times New Roman"/>
-                <w:noProof/>
-              </w:rPr>
-              <w:t>Own synthetic group</w:t>
-            </w:r>
-          </w:p>
-        </w:tc>
-        <w:tc>
-          <w:tcPr>
-            <w:tcW w:w="1523" w:type="dxa"/>
-            <w:tcBorders>
-              <w:top w:val="single" w:sz="4" w:space="0" w:color="auto"/>
-            </w:tcBorders>
-            <w:vAlign w:val="center"/>
-          </w:tcPr>
-          <w:p>
-            <w:pPr>
-              <w:jc w:val="center"/>
-              <w:rPr>
-                <w:rFonts w:ascii="Times New Roman" w:hAnsi="Times New Roman" w:cs="Times New Roman"/>
-                <w:noProof/>
-              </w:rPr>
-            </w:pPr>
-            <w:r>
-              <w:rPr>
-                <w:rFonts w:ascii="Times New Roman" w:hAnsi="Times New Roman" w:cs="Times New Roman"/>
-                <w:noProof/>
-              </w:rPr>
-              <w:t>-1.197*</w:t>
-            </w:r>
-          </w:p>
-        </w:tc>
-        <w:tc>
-          <w:tcPr>
-            <w:tcW w:w="1312" w:type="dxa"/>
-            <w:tcBorders>
-              <w:top w:val="single" w:sz="4" w:space="0" w:color="auto"/>
-            </w:tcBorders>
-            <w:vAlign w:val="center"/>
-          </w:tcPr>
-          <w:p>
-            <w:pPr>
-              <w:jc w:val="center"/>
-              <w:rPr>
-                <w:rFonts w:ascii="Times New Roman" w:hAnsi="Times New Roman" w:cs="Times New Roman"/>
-                <w:noProof/>
-              </w:rPr>
-            </w:pPr>
-            <w:r>
-              <w:rPr>
-                <w:rFonts w:ascii="Times New Roman" w:hAnsi="Times New Roman" w:cs="Times New Roman"/>
-                <w:noProof/>
-              </w:rPr>
-              <w:t>-1.265***</w:t>
-            </w:r>
-          </w:p>
-        </w:tc>
-        <w:tc>
-          <w:tcPr>
-            <w:tcW w:w="1312" w:type="dxa"/>
-            <w:tcBorders>
-              <w:top w:val="single" w:sz="4" w:space="0" w:color="auto"/>
-            </w:tcBorders>
-            <w:vAlign w:val="center"/>
-          </w:tcPr>
-          <w:p>
-            <w:pPr>
-              <w:jc w:val="center"/>
-              <w:rPr>
-                <w:rFonts w:ascii="Times New Roman" w:hAnsi="Times New Roman" w:cs="Times New Roman"/>
-                <w:noProof/>
-              </w:rPr>
-            </w:pPr>
-            <w:r>
-              <w:rPr>
-                <w:rFonts w:ascii="Times New Roman" w:hAnsi="Times New Roman" w:cs="Times New Roman"/>
-                <w:noProof/>
-              </w:rPr>
-              <w:t>-1.132***</w:t>
+                <w:rFonts w:ascii="Calibri" w:eastAsia="Times New Roman" w:hAnsi="Calibri" w:cs="Calibri"/>
+                <w:b/>
+                <w:bCs/>
+                <w:i/>
+                <w:color w:val="000000"/>
+                <w:kern w:val="0"/>
+                <w:sz w:val="22"/>
+                <w:szCs w:val="22"/>
+                <w14:ligatures w14:val="none"/>
+              </w:rPr>
+              <w:t>Panel A: Baseline estimates</w:t>
             </w:r>
           </w:p>
         </w:tc>
       </w:tr>
       <w:tr>
         <w:trPr>
-          <w:trHeight w:val="312"/>
+          <w:trHeight w:val="220"/>
           <w:jc w:val="center"/>
         </w:trPr>
         <w:tc>
           <w:tcPr>
-            <w:tcW w:w="1617" w:type="dxa"/>
-          </w:tcPr>
-          <w:p>
-            <w:pPr>
-              <w:jc w:val="both"/>
-              <w:rPr>
-                <w:rFonts w:ascii="Times New Roman" w:hAnsi="Times New Roman" w:cs="Times New Roman"/>
-                <w:noProof/>
-              </w:rPr>
-            </w:pPr>
-          </w:p>
-        </w:tc>
-        <w:tc>
-          <w:tcPr>
-            <w:tcW w:w="1523" w:type="dxa"/>
+            <w:tcW w:w="1129" w:type="dxa"/>
+            <w:vMerge w:val="restart"/>
+            <w:shd w:val="clear" w:color="auto" w:fill="auto"/>
             <w:vAlign w:val="center"/>
+            <w:hideMark/>
+          </w:tcPr>
+          <w:p>
+            <w:pPr>
+              <w:rPr>
+                <w:rFonts w:ascii="Calibri" w:eastAsia="Times New Roman" w:hAnsi="Calibri" w:cs="Calibri"/>
+                <w:color w:val="000000"/>
+                <w:kern w:val="0"/>
+                <w:sz w:val="22"/>
+                <w:szCs w:val="22"/>
+                <w14:ligatures w14:val="none"/>
+              </w:rPr>
+            </w:pPr>
+            <w:r>
+              <w:rPr>
+                <w:rFonts w:ascii="Calibri" w:eastAsia="Times New Roman" w:hAnsi="Calibri" w:cs="Calibri"/>
+                <w:color w:val="000000"/>
+                <w:kern w:val="0"/>
+                <w:sz w:val="22"/>
+                <w:szCs w:val="22"/>
+                <w14:ligatures w14:val="none"/>
+              </w:rPr>
+              <w:t>Synthetic control</w:t>
+            </w:r>
+          </w:p>
+        </w:tc>
+        <w:tc>
+          <w:tcPr>
+            <w:tcW w:w="1276" w:type="dxa"/>
+            <w:shd w:val="clear" w:color="auto" w:fill="auto"/>
+            <w:vAlign w:val="center"/>
+            <w:hideMark/>
           </w:tcPr>
           <w:p>
             <w:pPr>
               <w:jc w:val="center"/>
               <w:rPr>
-                <w:rFonts w:ascii="Times New Roman" w:hAnsi="Times New Roman" w:cs="Times New Roman"/>
-                <w:noProof/>
+                <w:rFonts w:ascii="Calibri" w:eastAsia="Times New Roman" w:hAnsi="Calibri" w:cs="Calibri"/>
+                <w:color w:val="000000"/>
+                <w:kern w:val="0"/>
+                <w:sz w:val="22"/>
+                <w:szCs w:val="22"/>
+                <w14:ligatures w14:val="none"/>
               </w:rPr>
             </w:pPr>
             <w:r>
               <w:rPr>
-                <w:rFonts w:ascii="Times New Roman" w:hAnsi="Times New Roman" w:cs="Times New Roman"/>
-                <w:noProof/>
-              </w:rPr>
-              <w:t>(</w:t>
+                <w:rFonts w:ascii="Calibri" w:eastAsia="Times New Roman" w:hAnsi="Calibri" w:cs="Calibri"/>
+                <w:color w:val="000000"/>
+                <w:kern w:val="0"/>
+                <w:sz w:val="22"/>
+                <w:szCs w:val="22"/>
+                <w14:ligatures w14:val="none"/>
+              </w:rPr>
+              <w:t>−1.197*</w:t>
             </w:r>
+          </w:p>
+        </w:tc>
+        <w:tc>
+          <w:tcPr>
+            <w:tcW w:w="1418" w:type="dxa"/>
+            <w:shd w:val="clear" w:color="auto" w:fill="auto"/>
+            <w:vAlign w:val="center"/>
+            <w:hideMark/>
+          </w:tcPr>
+          <w:p>
+            <w:pPr>
+              <w:jc w:val="center"/>
+              <w:rPr>
+                <w:rFonts w:ascii="Calibri" w:eastAsia="Times New Roman" w:hAnsi="Calibri" w:cs="Calibri"/>
+                <w:color w:val="000000"/>
+                <w:kern w:val="0"/>
+                <w:sz w:val="22"/>
+                <w:szCs w:val="22"/>
+                <w14:ligatures w14:val="none"/>
+              </w:rPr>
+            </w:pPr>
             <w:r>
               <w:rPr>
-                <w:rFonts w:ascii="Times New Roman" w:hAnsi="Times New Roman" w:cs="Times New Roman"/>
-                <w:noProof/>
-              </w:rPr>
-              <w:t>0.10</w:t>
+                <w:rFonts w:ascii="Calibri" w:eastAsia="Times New Roman" w:hAnsi="Calibri" w:cs="Calibri"/>
+                <w:color w:val="000000"/>
+                <w:kern w:val="0"/>
+                <w:sz w:val="22"/>
+                <w:szCs w:val="22"/>
+                <w14:ligatures w14:val="none"/>
+              </w:rPr>
+              <w:t>−1.265***</w:t>
             </w:r>
+          </w:p>
+        </w:tc>
+        <w:tc>
+          <w:tcPr>
+            <w:tcW w:w="1357" w:type="dxa"/>
+            <w:shd w:val="clear" w:color="auto" w:fill="auto"/>
+            <w:vAlign w:val="center"/>
+            <w:hideMark/>
+          </w:tcPr>
+          <w:p>
+            <w:pPr>
+              <w:jc w:val="center"/>
+              <w:rPr>
+                <w:rFonts w:ascii="Calibri" w:eastAsia="Times New Roman" w:hAnsi="Calibri" w:cs="Calibri"/>
+                <w:color w:val="000000"/>
+                <w:kern w:val="0"/>
+                <w:sz w:val="22"/>
+                <w:szCs w:val="22"/>
+                <w14:ligatures w14:val="none"/>
+              </w:rPr>
+            </w:pPr>
             <w:r>
               <w:rPr>
-                <w:rFonts w:ascii="Times New Roman" w:hAnsi="Times New Roman" w:cs="Times New Roman"/>
-                <w:noProof/>
-              </w:rPr>
-              <w:t>6)</w:t>
+                <w:rFonts w:ascii="Calibri" w:eastAsia="Times New Roman" w:hAnsi="Calibri" w:cs="Calibri"/>
+                <w:color w:val="000000"/>
+                <w:kern w:val="0"/>
+                <w:sz w:val="22"/>
+                <w:szCs w:val="22"/>
+                <w14:ligatures w14:val="none"/>
+              </w:rPr>
+              <w:t>−1.132***</w:t>
             </w:r>
-            <w:r>
-              <w:rPr>
-                <w:rFonts w:ascii="Times New Roman" w:hAnsi="Times New Roman" w:cs="Times New Roman"/>
-                <w:noProof/>
-              </w:rPr>
-              <w:tab/>
-            </w:r>
-          </w:p>
-        </w:tc>
-        <w:tc>
-          <w:tcPr>
-            <w:tcW w:w="1312" w:type="dxa"/>
-            <w:vAlign w:val="center"/>
-          </w:tcPr>
-          <w:p>
-            <w:pPr>
-              <w:jc w:val="center"/>
-              <w:rPr>
-                <w:rFonts w:ascii="Times New Roman" w:hAnsi="Times New Roman" w:cs="Times New Roman"/>
-                <w:noProof/>
-              </w:rPr>
-            </w:pPr>
-            <w:r>
-              <w:rPr>
-                <w:rFonts w:ascii="Times New Roman" w:hAnsi="Times New Roman" w:cs="Times New Roman"/>
-                <w:noProof/>
-              </w:rPr>
-              <w:t>(0.122)</w:t>
-            </w:r>
-          </w:p>
-        </w:tc>
-        <w:tc>
-          <w:tcPr>
-            <w:tcW w:w="1312" w:type="dxa"/>
-            <w:vAlign w:val="center"/>
-          </w:tcPr>
-          <w:p>
-            <w:pPr>
-              <w:jc w:val="center"/>
-              <w:rPr>
-                <w:rFonts w:ascii="Times New Roman" w:hAnsi="Times New Roman" w:cs="Times New Roman"/>
-                <w:noProof/>
-              </w:rPr>
-            </w:pPr>
-            <w:r>
-              <w:rPr>
-                <w:rFonts w:ascii="Times New Roman" w:hAnsi="Times New Roman" w:cs="Times New Roman"/>
-                <w:noProof/>
-              </w:rPr>
-              <w:t>(0.126)</w:t>
-            </w:r>
-          </w:p>
-        </w:tc>
-        <w:tc>
-          <w:tcPr>
-            <w:tcW w:w="1672" w:type="dxa"/>
-            <w:vAlign w:val="center"/>
-          </w:tcPr>
-          <w:p>
-            <w:pPr>
-              <w:jc w:val="center"/>
-              <w:rPr>
-                <w:rFonts w:ascii="Times New Roman" w:hAnsi="Times New Roman" w:cs="Times New Roman"/>
-                <w:noProof/>
-              </w:rPr>
-            </w:pPr>
-          </w:p>
-        </w:tc>
-        <w:tc>
-          <w:tcPr>
-            <w:tcW w:w="1590" w:type="dxa"/>
-            <w:vAlign w:val="center"/>
-          </w:tcPr>
-          <w:p>
-            <w:pPr>
-              <w:jc w:val="center"/>
-              <w:rPr>
-                <w:rFonts w:ascii="Times New Roman" w:hAnsi="Times New Roman" w:cs="Times New Roman"/>
-                <w:noProof/>
-              </w:rPr>
-            </w:pPr>
           </w:p>
         </w:tc>
       </w:tr>
       <w:tr>
         <w:trPr>
-          <w:gridAfter w:val="2"/>
-          <w:wAfter w:w="3262" w:type="dxa"/>
+          <w:trHeight w:val="288"/>
           <w:jc w:val="center"/>
         </w:trPr>
         <w:tc>
           <w:tcPr>
-            <w:tcW w:w="1617" w:type="dxa"/>
-          </w:tcPr>
-          <w:p>
-            <w:pPr>
-              <w:jc w:val="both"/>
-              <w:rPr>
-                <w:rFonts w:ascii="Times New Roman" w:hAnsi="Times New Roman" w:cs="Times New Roman"/>
-                <w:noProof/>
+            <w:tcW w:w="1129" w:type="dxa"/>
+            <w:vMerge/>
+            <w:shd w:val="clear" w:color="auto" w:fill="auto"/>
+            <w:vAlign w:val="center"/>
+            <w:hideMark/>
+          </w:tcPr>
+          <w:p>
+            <w:pPr>
+              <w:jc w:val="center"/>
+              <w:rPr>
+                <w:rFonts w:ascii="Calibri" w:eastAsia="Times New Roman" w:hAnsi="Calibri" w:cs="Calibri"/>
+                <w:color w:val="000000"/>
+                <w:kern w:val="0"/>
+                <w:sz w:val="22"/>
+                <w:szCs w:val="22"/>
+                <w14:ligatures w14:val="none"/>
+              </w:rPr>
+            </w:pPr>
+          </w:p>
+        </w:tc>
+        <w:tc>
+          <w:tcPr>
+            <w:tcW w:w="1276" w:type="dxa"/>
+            <w:shd w:val="clear" w:color="auto" w:fill="auto"/>
+            <w:vAlign w:val="center"/>
+            <w:hideMark/>
+          </w:tcPr>
+          <w:p>
+            <w:pPr>
+              <w:jc w:val="center"/>
+              <w:rPr>
+                <w:rFonts w:ascii="Calibri" w:eastAsia="Times New Roman" w:hAnsi="Calibri" w:cs="Calibri"/>
+                <w:color w:val="000000"/>
+                <w:kern w:val="0"/>
+                <w:sz w:val="22"/>
+                <w:szCs w:val="22"/>
+                <w14:ligatures w14:val="none"/>
               </w:rPr>
             </w:pPr>
             <w:r>
               <w:rPr>
-                <w:rFonts w:ascii="Times New Roman" w:hAnsi="Times New Roman" w:cs="Times New Roman"/>
-                <w:noProof/>
-              </w:rPr>
-              <w:t>Poor countries</w:t>
+                <w:rFonts w:ascii="Calibri" w:eastAsia="Times New Roman" w:hAnsi="Calibri" w:cs="Calibri"/>
+                <w:color w:val="000000"/>
+                <w:kern w:val="0"/>
+                <w:sz w:val="22"/>
+                <w:szCs w:val="22"/>
+                <w14:ligatures w14:val="none"/>
+              </w:rPr>
+              <w:t>(0.106)</w:t>
             </w:r>
           </w:p>
         </w:tc>
         <w:tc>
           <w:tcPr>
-            <w:tcW w:w="1523" w:type="dxa"/>
+            <w:tcW w:w="1418" w:type="dxa"/>
+            <w:shd w:val="clear" w:color="auto" w:fill="auto"/>
             <w:vAlign w:val="center"/>
+            <w:hideMark/>
           </w:tcPr>
           <w:p>
             <w:pPr>
               <w:jc w:val="center"/>
               <w:rPr>
-                <w:rFonts w:ascii="Times New Roman" w:hAnsi="Times New Roman" w:cs="Times New Roman"/>
-                <w:noProof/>
+                <w:rFonts w:ascii="Calibri" w:eastAsia="Times New Roman" w:hAnsi="Calibri" w:cs="Calibri"/>
+                <w:color w:val="000000"/>
+                <w:kern w:val="0"/>
+                <w:sz w:val="22"/>
+                <w:szCs w:val="22"/>
+                <w14:ligatures w14:val="none"/>
               </w:rPr>
             </w:pPr>
             <w:r>
               <w:rPr>
-                <w:rFonts w:ascii="Times New Roman" w:hAnsi="Times New Roman" w:cs="Times New Roman"/>
-                <w:noProof/>
-              </w:rPr>
-              <w:t>-1.</w:t>
+                <w:rFonts w:ascii="Calibri" w:eastAsia="Times New Roman" w:hAnsi="Calibri" w:cs="Calibri"/>
+                <w:color w:val="000000"/>
+                <w:kern w:val="0"/>
+                <w:sz w:val="22"/>
+                <w:szCs w:val="22"/>
+                <w14:ligatures w14:val="none"/>
+              </w:rPr>
+              <w:t>(0.122)</w:t>
             </w:r>
+          </w:p>
+        </w:tc>
+        <w:tc>
+          <w:tcPr>
+            <w:tcW w:w="1357" w:type="dxa"/>
+            <w:shd w:val="clear" w:color="auto" w:fill="auto"/>
+            <w:vAlign w:val="center"/>
+            <w:hideMark/>
+          </w:tcPr>
+          <w:p>
+            <w:pPr>
+              <w:jc w:val="center"/>
+              <w:rPr>
+                <w:rFonts w:ascii="Calibri" w:eastAsia="Times New Roman" w:hAnsi="Calibri" w:cs="Calibri"/>
+                <w:color w:val="000000"/>
+                <w:kern w:val="0"/>
+                <w:sz w:val="22"/>
+                <w:szCs w:val="22"/>
+                <w14:ligatures w14:val="none"/>
+              </w:rPr>
+            </w:pPr>
             <w:r>
               <w:rPr>
-                <w:rFonts w:ascii="Times New Roman" w:hAnsi="Times New Roman" w:cs="Times New Roman"/>
-                <w:noProof/>
-              </w:rPr>
-              <w:t>48*</w:t>
+                <w:rFonts w:ascii="Calibri" w:eastAsia="Times New Roman" w:hAnsi="Calibri" w:cs="Calibri"/>
+                <w:color w:val="000000"/>
+                <w:kern w:val="0"/>
+                <w:sz w:val="22"/>
+                <w:szCs w:val="22"/>
+                <w14:ligatures w14:val="none"/>
+              </w:rPr>
+              <w:t>(0.126)</w:t>
             </w:r>
-          </w:p>
-        </w:tc>
-        <w:tc>
-          <w:tcPr>
-            <w:tcW w:w="1312" w:type="dxa"/>
-            <w:vAlign w:val="center"/>
-          </w:tcPr>
-          <w:p>
-            <w:pPr>
-              <w:jc w:val="center"/>
-              <w:rPr>
-                <w:rFonts w:ascii="Times New Roman" w:hAnsi="Times New Roman" w:cs="Times New Roman"/>
-                <w:noProof/>
-              </w:rPr>
-            </w:pPr>
-            <w:r>
-              <w:rPr>
-                <w:rFonts w:ascii="Times New Roman" w:hAnsi="Times New Roman" w:cs="Times New Roman"/>
-                <w:noProof/>
-              </w:rPr>
-              <w:t>-1.67***</w:t>
-            </w:r>
-          </w:p>
-        </w:tc>
-        <w:tc>
-          <w:tcPr>
-            <w:tcW w:w="1312" w:type="dxa"/>
-          </w:tcPr>
-          <w:p>
-            <w:pPr>
-              <w:jc w:val="center"/>
-              <w:rPr>
-                <w:rFonts w:ascii="Times New Roman" w:hAnsi="Times New Roman" w:cs="Times New Roman"/>
-                <w:noProof/>
-              </w:rPr>
-            </w:pPr>
           </w:p>
         </w:tc>
       </w:tr>
       <w:tr>
         <w:trPr>
-          <w:gridAfter w:val="2"/>
-          <w:wAfter w:w="3262" w:type="dxa"/>
+          <w:trHeight w:val="132"/>
           <w:jc w:val="center"/>
         </w:trPr>
         <w:tc>
           <w:tcPr>
-            <w:tcW w:w="1617" w:type="dxa"/>
-          </w:tcPr>
-          <w:p>
-            <w:pPr>
-              <w:jc w:val="both"/>
-              <w:rPr>
-                <w:rFonts w:ascii="Times New Roman" w:hAnsi="Times New Roman" w:cs="Times New Roman"/>
-                <w:noProof/>
-              </w:rPr>
-            </w:pPr>
-          </w:p>
-        </w:tc>
-        <w:tc>
-          <w:tcPr>
-            <w:tcW w:w="1523" w:type="dxa"/>
+            <w:tcW w:w="5180" w:type="dxa"/>
+            <w:gridSpan w:val="4"/>
+            <w:shd w:val="clear" w:color="auto" w:fill="auto"/>
             <w:vAlign w:val="center"/>
+            <w:hideMark/>
           </w:tcPr>
           <w:p>
             <w:pPr>
               <w:jc w:val="center"/>
               <w:rPr>
-                <w:rFonts w:ascii="Times New Roman" w:hAnsi="Times New Roman" w:cs="Times New Roman"/>
-                <w:noProof/>
+                <w:rFonts w:ascii="Calibri" w:eastAsia="Times New Roman" w:hAnsi="Calibri" w:cs="Calibri"/>
+                <w:b/>
+                <w:bCs/>
+                <w:i/>
+                <w:color w:val="000000"/>
+                <w:kern w:val="0"/>
+                <w:sz w:val="22"/>
+                <w:szCs w:val="22"/>
+                <w14:ligatures w14:val="none"/>
               </w:rPr>
             </w:pPr>
             <w:r>
               <w:rPr>
-                <w:rFonts w:ascii="Times New Roman" w:hAnsi="Times New Roman" w:cs="Times New Roman"/>
-                <w:noProof/>
-              </w:rPr>
-              <w:t>(</w:t>
+                <w:rFonts w:ascii="Calibri" w:eastAsia="Times New Roman" w:hAnsi="Calibri" w:cs="Calibri"/>
+                <w:b/>
+                <w:bCs/>
+                <w:i/>
+                <w:color w:val="000000"/>
+                <w:kern w:val="0"/>
+                <w:sz w:val="22"/>
+                <w:szCs w:val="22"/>
+                <w14:ligatures w14:val="none"/>
+              </w:rPr>
+              <w:t>Panel B: Alternative samples</w:t>
             </w:r>
-            <w:r>
-              <w:rPr>
-                <w:rFonts w:ascii="Times New Roman" w:hAnsi="Times New Roman" w:cs="Times New Roman"/>
-                <w:noProof/>
-              </w:rPr>
-              <w:t>0.156</w:t>
-            </w:r>
-            <w:r>
-              <w:rPr>
-                <w:rFonts w:ascii="Times New Roman" w:hAnsi="Times New Roman" w:cs="Times New Roman"/>
-                <w:noProof/>
-              </w:rPr>
-              <w:t>)</w:t>
-            </w:r>
-          </w:p>
-        </w:tc>
-        <w:tc>
-          <w:tcPr>
-            <w:tcW w:w="1312" w:type="dxa"/>
-            <w:vAlign w:val="center"/>
-          </w:tcPr>
-          <w:p>
-            <w:pPr>
-              <w:jc w:val="center"/>
-              <w:rPr>
-                <w:rFonts w:ascii="Times New Roman" w:hAnsi="Times New Roman" w:cs="Times New Roman"/>
-                <w:noProof/>
-              </w:rPr>
-            </w:pPr>
-            <w:r>
-              <w:rPr>
-                <w:rFonts w:ascii="Times New Roman" w:hAnsi="Times New Roman" w:cs="Times New Roman"/>
-                <w:noProof/>
-              </w:rPr>
-              <w:t>(0.20)</w:t>
-            </w:r>
-          </w:p>
-        </w:tc>
-        <w:tc>
-          <w:tcPr>
-            <w:tcW w:w="1312" w:type="dxa"/>
-          </w:tcPr>
-          <w:p>
-            <w:pPr>
-              <w:jc w:val="center"/>
-              <w:rPr>
-                <w:rFonts w:ascii="Times New Roman" w:hAnsi="Times New Roman" w:cs="Times New Roman"/>
-                <w:noProof/>
-              </w:rPr>
-            </w:pPr>
           </w:p>
         </w:tc>
       </w:tr>
       <w:tr>
         <w:trPr>
-          <w:gridAfter w:val="2"/>
-          <w:wAfter w:w="3262" w:type="dxa"/>
+          <w:trHeight w:val="58"/>
           <w:jc w:val="center"/>
         </w:trPr>
         <w:tc>
           <w:tcPr>
-            <w:tcW w:w="1617" w:type="dxa"/>
-          </w:tcPr>
-          <w:p>
-            <w:pPr>
-              <w:jc w:val="both"/>
-              <w:rPr>
-                <w:rFonts w:ascii="Times New Roman" w:hAnsi="Times New Roman" w:cs="Times New Roman"/>
-                <w:noProof/>
+            <w:tcW w:w="1129" w:type="dxa"/>
+            <w:vMerge w:val="restart"/>
+            <w:shd w:val="clear" w:color="auto" w:fill="auto"/>
+            <w:vAlign w:val="center"/>
+            <w:hideMark/>
+          </w:tcPr>
+          <w:p>
+            <w:pPr>
+              <w:rPr>
+                <w:rFonts w:ascii="Calibri" w:eastAsia="Times New Roman" w:hAnsi="Calibri" w:cs="Calibri"/>
+                <w:color w:val="000000"/>
+                <w:kern w:val="0"/>
+                <w:sz w:val="22"/>
+                <w:szCs w:val="22"/>
+                <w14:ligatures w14:val="none"/>
               </w:rPr>
             </w:pPr>
             <w:r>
               <w:rPr>
-                <w:rFonts w:ascii="Times New Roman" w:hAnsi="Times New Roman" w:cs="Times New Roman"/>
-                <w:noProof/>
-              </w:rPr>
-              <w:t>Rich countries</w:t>
+                <w:rFonts w:ascii="Calibri" w:eastAsia="Times New Roman" w:hAnsi="Calibri" w:cs="Calibri"/>
+                <w:color w:val="000000"/>
+                <w:kern w:val="0"/>
+                <w:sz w:val="22"/>
+                <w:szCs w:val="22"/>
+                <w14:ligatures w14:val="none"/>
+              </w:rPr>
+              <w:lastRenderedPageBreak/>
+              <w:t>Poor countries</w:t>
             </w:r>
           </w:p>
         </w:tc>
         <w:tc>
           <w:tcPr>
-            <w:tcW w:w="1523" w:type="dxa"/>
+            <w:tcW w:w="1276" w:type="dxa"/>
+            <w:shd w:val="clear" w:color="auto" w:fill="auto"/>
             <w:vAlign w:val="center"/>
+            <w:hideMark/>
           </w:tcPr>
           <w:p>
             <w:pPr>
               <w:jc w:val="center"/>
               <w:rPr>
-                <w:rFonts w:ascii="Times New Roman" w:hAnsi="Times New Roman" w:cs="Times New Roman"/>
-                <w:noProof/>
+                <w:rFonts w:ascii="Calibri" w:eastAsia="Times New Roman" w:hAnsi="Calibri" w:cs="Calibri"/>
+                <w:color w:val="000000"/>
+                <w:kern w:val="0"/>
+                <w:sz w:val="22"/>
+                <w:szCs w:val="22"/>
+                <w14:ligatures w14:val="none"/>
               </w:rPr>
             </w:pPr>
             <w:r>
               <w:rPr>
-                <w:rFonts w:ascii="Times New Roman" w:hAnsi="Times New Roman" w:cs="Times New Roman"/>
-                <w:noProof/>
-              </w:rPr>
-              <w:t>-1.</w:t>
+                <w:rFonts w:ascii="Calibri" w:eastAsia="Times New Roman" w:hAnsi="Calibri" w:cs="Calibri"/>
+                <w:color w:val="000000"/>
+                <w:kern w:val="0"/>
+                <w:sz w:val="22"/>
+                <w:szCs w:val="22"/>
+                <w14:ligatures w14:val="none"/>
+              </w:rPr>
+              <w:t>−1.48*</w:t>
+            </w:r>
+          </w:p>
+        </w:tc>
+        <w:tc>
+          <w:tcPr>
+            <w:tcW w:w="1418" w:type="dxa"/>
+            <w:shd w:val="clear" w:color="auto" w:fill="auto"/>
+            <w:vAlign w:val="center"/>
+            <w:hideMark/>
+          </w:tcPr>
+          <w:p>
+            <w:pPr>
+              <w:jc w:val="center"/>
+              <w:rPr>
+                <w:rFonts w:ascii="Calibri" w:eastAsia="Times New Roman" w:hAnsi="Calibri" w:cs="Calibri"/>
+                <w:color w:val="000000"/>
+                <w:kern w:val="0"/>
+                <w:sz w:val="22"/>
+                <w:szCs w:val="22"/>
+                <w14:ligatures w14:val="none"/>
+              </w:rPr>
+            </w:pPr>
+            <w:r>
+              <w:rPr>
+                <w:rFonts w:ascii="Calibri" w:eastAsia="Times New Roman" w:hAnsi="Calibri" w:cs="Calibri"/>
+                <w:color w:val="000000"/>
+                <w:kern w:val="0"/>
+                <w:sz w:val="22"/>
+                <w:szCs w:val="22"/>
+                <w14:ligatures w14:val="none"/>
+              </w:rPr>
+              <w:t>−1.67***</w:t>
+            </w:r>
+          </w:p>
+        </w:tc>
+        <w:tc>
+          <w:tcPr>
+            <w:tcW w:w="1357" w:type="dxa"/>
+            <w:shd w:val="clear" w:color="auto" w:fill="auto"/>
+            <w:vAlign w:val="center"/>
+            <w:hideMark/>
+          </w:tcPr>
+          <w:p>
+            <w:pPr>
+              <w:jc w:val="center"/>
+              <w:rPr>
+                <w:rFonts w:ascii="Calibri" w:eastAsia="Times New Roman" w:hAnsi="Calibri" w:cs="Calibri"/>
+                <w:color w:val="000000"/>
+                <w:kern w:val="0"/>
+                <w:sz w:val="22"/>
+                <w:szCs w:val="22"/>
+                <w14:ligatures w14:val="none"/>
+              </w:rPr>
+            </w:pPr>
+            <w:r>
+              <w:rPr>
+                <w:rFonts w:ascii="Calibri" w:eastAsia="Times New Roman" w:hAnsi="Calibri" w:cs="Calibri"/>
+                <w:color w:val="000000"/>
+                <w:kern w:val="0"/>
+                <w:sz w:val="22"/>
+                <w:szCs w:val="22"/>
+                <w14:ligatures w14:val="none"/>
+              </w:rPr>
+              <w:t>-1.59</w:t>
             </w:r>
             <w:r>
               <w:rPr>
-                <w:rFonts w:ascii="Times New Roman" w:hAnsi="Times New Roman" w:cs="Times New Roman"/>
-                <w:noProof/>
-              </w:rPr>
-              <w:t>23*</w:t>
+                <w:rFonts w:ascii="Calibri" w:eastAsia="Times New Roman" w:hAnsi="Calibri" w:cs="Calibri"/>
+                <w:color w:val="000000"/>
+                <w:kern w:val="0"/>
+                <w:sz w:val="22"/>
+                <w:szCs w:val="22"/>
+                <w14:ligatures w14:val="none"/>
+              </w:rPr>
+              <w:t>***</w:t>
             </w:r>
-          </w:p>
-        </w:tc>
-        <w:tc>
-          <w:tcPr>
-            <w:tcW w:w="1312" w:type="dxa"/>
-            <w:vAlign w:val="center"/>
-          </w:tcPr>
-          <w:p>
-            <w:pPr>
-              <w:jc w:val="center"/>
-              <w:rPr>
-                <w:rFonts w:ascii="Times New Roman" w:hAnsi="Times New Roman" w:cs="Times New Roman"/>
-                <w:noProof/>
-              </w:rPr>
-            </w:pPr>
-            <w:r>
-              <w:rPr>
-                <w:rFonts w:ascii="Times New Roman" w:hAnsi="Times New Roman" w:cs="Times New Roman"/>
-                <w:noProof/>
-              </w:rPr>
-              <w:t>-1.32***</w:t>
-            </w:r>
-          </w:p>
-        </w:tc>
-        <w:tc>
-          <w:tcPr>
-            <w:tcW w:w="1312" w:type="dxa"/>
-          </w:tcPr>
-          <w:p>
-            <w:pPr>
-              <w:jc w:val="center"/>
-              <w:rPr>
-                <w:rFonts w:ascii="Times New Roman" w:hAnsi="Times New Roman" w:cs="Times New Roman"/>
-                <w:noProof/>
-              </w:rPr>
-            </w:pPr>
           </w:p>
         </w:tc>
       </w:tr>
       <w:tr>
         <w:trPr>
-          <w:gridAfter w:val="2"/>
-          <w:wAfter w:w="3262" w:type="dxa"/>
+          <w:trHeight w:val="288"/>
           <w:jc w:val="center"/>
         </w:trPr>
         <w:tc>
           <w:tcPr>
-            <w:tcW w:w="1617" w:type="dxa"/>
-          </w:tcPr>
-          <w:p>
-            <w:pPr>
-              <w:jc w:val="both"/>
-              <w:rPr>
-                <w:rFonts w:ascii="Times New Roman" w:hAnsi="Times New Roman" w:cs="Times New Roman"/>
-                <w:noProof/>
-              </w:rPr>
-            </w:pPr>
-          </w:p>
-        </w:tc>
-        <w:tc>
-          <w:tcPr>
-            <w:tcW w:w="1523" w:type="dxa"/>
+            <w:tcW w:w="1129" w:type="dxa"/>
+            <w:vMerge/>
+            <w:shd w:val="clear" w:color="auto" w:fill="auto"/>
             <w:vAlign w:val="center"/>
+            <w:hideMark/>
           </w:tcPr>
           <w:p>
             <w:pPr>
               <w:jc w:val="center"/>
               <w:rPr>
-                <w:rFonts w:ascii="Times New Roman" w:hAnsi="Times New Roman" w:cs="Times New Roman"/>
-                <w:noProof/>
+                <w:rFonts w:ascii="Times New Roman" w:eastAsia="Times New Roman" w:hAnsi="Times New Roman" w:cs="Times New Roman"/>
+                <w:kern w:val="0"/>
+                <w:sz w:val="20"/>
+                <w:szCs w:val="20"/>
+                <w14:ligatures w14:val="none"/>
+              </w:rPr>
+            </w:pPr>
+          </w:p>
+        </w:tc>
+        <w:tc>
+          <w:tcPr>
+            <w:tcW w:w="1276" w:type="dxa"/>
+            <w:shd w:val="clear" w:color="auto" w:fill="auto"/>
+            <w:vAlign w:val="center"/>
+            <w:hideMark/>
+          </w:tcPr>
+          <w:p>
+            <w:pPr>
+              <w:jc w:val="center"/>
+              <w:rPr>
+                <w:rFonts w:ascii="Calibri" w:eastAsia="Times New Roman" w:hAnsi="Calibri" w:cs="Calibri"/>
+                <w:color w:val="000000"/>
+                <w:kern w:val="0"/>
+                <w:sz w:val="22"/>
+                <w:szCs w:val="22"/>
+                <w14:ligatures w14:val="none"/>
               </w:rPr>
             </w:pPr>
             <w:r>
               <w:rPr>
-                <w:rFonts w:ascii="Times New Roman" w:hAnsi="Times New Roman" w:cs="Times New Roman"/>
-                <w:noProof/>
-              </w:rPr>
-              <w:t>(</w:t>
+                <w:rFonts w:ascii="Calibri" w:eastAsia="Times New Roman" w:hAnsi="Calibri" w:cs="Calibri"/>
+                <w:color w:val="000000"/>
+                <w:kern w:val="0"/>
+                <w:sz w:val="22"/>
+                <w:szCs w:val="22"/>
+                <w14:ligatures w14:val="none"/>
+              </w:rPr>
+              <w:t>(0.156)</w:t>
             </w:r>
+          </w:p>
+        </w:tc>
+        <w:tc>
+          <w:tcPr>
+            <w:tcW w:w="1418" w:type="dxa"/>
+            <w:shd w:val="clear" w:color="auto" w:fill="auto"/>
+            <w:vAlign w:val="center"/>
+            <w:hideMark/>
+          </w:tcPr>
+          <w:p>
+            <w:pPr>
+              <w:jc w:val="center"/>
+              <w:rPr>
+                <w:rFonts w:ascii="Calibri" w:eastAsia="Times New Roman" w:hAnsi="Calibri" w:cs="Calibri"/>
+                <w:color w:val="000000"/>
+                <w:kern w:val="0"/>
+                <w:sz w:val="22"/>
+                <w:szCs w:val="22"/>
+                <w14:ligatures w14:val="none"/>
+              </w:rPr>
+            </w:pPr>
             <w:r>
               <w:rPr>
-                <w:rFonts w:ascii="Times New Roman" w:hAnsi="Times New Roman" w:cs="Times New Roman"/>
-                <w:noProof/>
-              </w:rPr>
-              <w:t>0.12</w:t>
+                <w:rFonts w:ascii="Calibri" w:eastAsia="Times New Roman" w:hAnsi="Calibri" w:cs="Calibri"/>
+                <w:color w:val="000000"/>
+                <w:kern w:val="0"/>
+                <w:sz w:val="22"/>
+                <w:szCs w:val="22"/>
+                <w14:ligatures w14:val="none"/>
+              </w:rPr>
+              <w:t>(0.200)</w:t>
             </w:r>
+          </w:p>
+        </w:tc>
+        <w:tc>
+          <w:tcPr>
+            <w:tcW w:w="1357" w:type="dxa"/>
+            <w:shd w:val="clear" w:color="auto" w:fill="auto"/>
+            <w:vAlign w:val="center"/>
+            <w:hideMark/>
+          </w:tcPr>
+          <w:p>
+            <w:pPr>
+              <w:jc w:val="center"/>
+              <w:rPr>
+                <w:rFonts w:ascii="Calibri" w:eastAsia="Times New Roman" w:hAnsi="Calibri" w:cs="Calibri"/>
+                <w:color w:val="000000"/>
+                <w:kern w:val="0"/>
+                <w:sz w:val="22"/>
+                <w:szCs w:val="22"/>
+                <w14:ligatures w14:val="none"/>
+              </w:rPr>
+            </w:pPr>
             <w:r>
               <w:rPr>
-                <w:rFonts w:ascii="Times New Roman" w:hAnsi="Times New Roman" w:cs="Times New Roman"/>
-                <w:noProof/>
-              </w:rPr>
-              <w:t>2)</w:t>
+                <w:rFonts w:ascii="Calibri" w:eastAsia="Times New Roman" w:hAnsi="Calibri" w:cs="Calibri"/>
+                <w:color w:val="000000"/>
+                <w:kern w:val="0"/>
+                <w:sz w:val="22"/>
+                <w:szCs w:val="22"/>
+                <w14:ligatures w14:val="none"/>
+              </w:rPr>
+              <w:t>(0.167)</w:t>
             </w:r>
-          </w:p>
-        </w:tc>
-        <w:tc>
-          <w:tcPr>
-            <w:tcW w:w="1312" w:type="dxa"/>
-            <w:vAlign w:val="center"/>
-          </w:tcPr>
-          <w:p>
-            <w:pPr>
-              <w:jc w:val="center"/>
-              <w:rPr>
-                <w:rFonts w:ascii="Times New Roman" w:hAnsi="Times New Roman" w:cs="Times New Roman"/>
-                <w:noProof/>
-              </w:rPr>
-            </w:pPr>
-            <w:r>
-              <w:rPr>
-                <w:rFonts w:ascii="Times New Roman" w:hAnsi="Times New Roman" w:cs="Times New Roman"/>
-                <w:noProof/>
-              </w:rPr>
-              <w:t>(0.13)</w:t>
-            </w:r>
-          </w:p>
-        </w:tc>
-        <w:tc>
-          <w:tcPr>
-            <w:tcW w:w="1312" w:type="dxa"/>
-          </w:tcPr>
-          <w:p>
-            <w:pPr>
-              <w:jc w:val="center"/>
-              <w:rPr>
-                <w:rFonts w:ascii="Times New Roman" w:hAnsi="Times New Roman" w:cs="Times New Roman"/>
-                <w:noProof/>
-              </w:rPr>
-            </w:pPr>
           </w:p>
         </w:tc>
       </w:tr>
       <w:tr>
         <w:trPr>
-          <w:gridAfter w:val="2"/>
-          <w:wAfter w:w="3262" w:type="dxa"/>
+          <w:trHeight w:val="155"/>
           <w:jc w:val="center"/>
         </w:trPr>
         <w:tc>
           <w:tcPr>
-            <w:tcW w:w="1617" w:type="dxa"/>
-          </w:tcPr>
-          <w:p>
-            <w:pPr>
-              <w:jc w:val="both"/>
-              <w:rPr>
-                <w:rFonts w:ascii="Times New Roman" w:hAnsi="Times New Roman" w:cs="Times New Roman"/>
-                <w:noProof/>
+            <w:tcW w:w="1129" w:type="dxa"/>
+            <w:vMerge w:val="restart"/>
+            <w:shd w:val="clear" w:color="auto" w:fill="auto"/>
+            <w:vAlign w:val="center"/>
+            <w:hideMark/>
+          </w:tcPr>
+          <w:p>
+            <w:pPr>
+              <w:rPr>
+                <w:rFonts w:ascii="Calibri" w:eastAsia="Times New Roman" w:hAnsi="Calibri" w:cs="Calibri"/>
+                <w:color w:val="000000"/>
+                <w:kern w:val="0"/>
+                <w:sz w:val="22"/>
+                <w:szCs w:val="22"/>
+                <w14:ligatures w14:val="none"/>
               </w:rPr>
             </w:pPr>
             <w:r>
               <w:rPr>
-                <w:rFonts w:ascii="Times New Roman" w:hAnsi="Times New Roman" w:cs="Times New Roman"/>
-                <w:noProof/>
-              </w:rPr>
-              <w:t>OECD countries</w:t>
+                <w:rFonts w:ascii="Calibri" w:eastAsia="Times New Roman" w:hAnsi="Calibri" w:cs="Calibri"/>
+                <w:color w:val="000000"/>
+                <w:kern w:val="0"/>
+                <w:sz w:val="22"/>
+                <w:szCs w:val="22"/>
+                <w14:ligatures w14:val="none"/>
+              </w:rPr>
+              <w:t>Rich countries</w:t>
             </w:r>
           </w:p>
         </w:tc>
         <w:tc>
           <w:tcPr>
-            <w:tcW w:w="1523" w:type="dxa"/>
+            <w:tcW w:w="1276" w:type="dxa"/>
+            <w:shd w:val="clear" w:color="auto" w:fill="auto"/>
             <w:vAlign w:val="center"/>
+            <w:hideMark/>
           </w:tcPr>
           <w:p>
             <w:pPr>
               <w:jc w:val="center"/>
               <w:rPr>
-                <w:rFonts w:ascii="Times New Roman" w:hAnsi="Times New Roman" w:cs="Times New Roman"/>
-                <w:noProof/>
-                <w:lang w:val="bg-BG"/>
+                <w:rFonts w:ascii="Calibri" w:eastAsia="Times New Roman" w:hAnsi="Calibri" w:cs="Calibri"/>
+                <w:color w:val="000000"/>
+                <w:kern w:val="0"/>
+                <w:sz w:val="22"/>
+                <w:szCs w:val="22"/>
+                <w14:ligatures w14:val="none"/>
               </w:rPr>
             </w:pPr>
             <w:r>
               <w:rPr>
-                <w:rFonts w:ascii="Times New Roman" w:hAnsi="Times New Roman" w:cs="Times New Roman"/>
-                <w:noProof/>
-              </w:rPr>
-              <w:t>-1.18*</w:t>
+                <w:rFonts w:ascii="Calibri" w:eastAsia="Times New Roman" w:hAnsi="Calibri" w:cs="Calibri"/>
+                <w:color w:val="000000"/>
+                <w:kern w:val="0"/>
+                <w:sz w:val="22"/>
+                <w:szCs w:val="22"/>
+                <w14:ligatures w14:val="none"/>
+              </w:rPr>
+              <w:t>−1.23*</w:t>
             </w:r>
           </w:p>
         </w:tc>
         <w:tc>
           <w:tcPr>
-            <w:tcW w:w="1312" w:type="dxa"/>
+            <w:tcW w:w="1418" w:type="dxa"/>
+            <w:shd w:val="clear" w:color="auto" w:fill="auto"/>
             <w:vAlign w:val="center"/>
+            <w:hideMark/>
           </w:tcPr>
           <w:p>
             <w:pPr>
               <w:jc w:val="center"/>
               <w:rPr>
-                <w:rFonts w:ascii="Times New Roman" w:hAnsi="Times New Roman" w:cs="Times New Roman"/>
-                <w:noProof/>
+                <w:rFonts w:ascii="Calibri" w:eastAsia="Times New Roman" w:hAnsi="Calibri" w:cs="Calibri"/>
+                <w:color w:val="000000"/>
+                <w:kern w:val="0"/>
+                <w:sz w:val="22"/>
+                <w:szCs w:val="22"/>
+                <w14:ligatures w14:val="none"/>
               </w:rPr>
             </w:pPr>
             <w:r>
               <w:rPr>
-                <w:rFonts w:ascii="Times New Roman" w:hAnsi="Times New Roman" w:cs="Times New Roman"/>
-                <w:noProof/>
-              </w:rPr>
-              <w:t>-1.26***</w:t>
+                <w:rFonts w:ascii="Calibri" w:eastAsia="Times New Roman" w:hAnsi="Calibri" w:cs="Calibri"/>
+                <w:color w:val="000000"/>
+                <w:kern w:val="0"/>
+                <w:sz w:val="22"/>
+                <w:szCs w:val="22"/>
+                <w14:ligatures w14:val="none"/>
+              </w:rPr>
+              <w:t>−1.32***</w:t>
             </w:r>
           </w:p>
         </w:tc>
         <w:tc>
           <w:tcPr>
-            <w:tcW w:w="1312" w:type="dxa"/>
+            <w:tcW w:w="1357" w:type="dxa"/>
+            <w:shd w:val="clear" w:color="auto" w:fill="auto"/>
+            <w:vAlign w:val="center"/>
+            <w:hideMark/>
           </w:tcPr>
           <w:p>
             <w:pPr>
               <w:jc w:val="center"/>
               <w:rPr>
-                <w:rFonts w:ascii="Times New Roman" w:hAnsi="Times New Roman" w:cs="Times New Roman"/>
-                <w:noProof/>
-              </w:rPr>
-            </w:pPr>
+                <w:rFonts w:ascii="Calibri" w:eastAsia="Times New Roman" w:hAnsi="Calibri" w:cs="Calibri"/>
+                <w:color w:val="000000"/>
+                <w:kern w:val="0"/>
+                <w:sz w:val="22"/>
+                <w:szCs w:val="22"/>
+                <w14:ligatures w14:val="none"/>
+              </w:rPr>
+            </w:pPr>
+            <w:r>
+              <w:rPr>
+                <w:rFonts w:ascii="Calibri" w:eastAsia="Times New Roman" w:hAnsi="Calibri" w:cs="Calibri"/>
+                <w:color w:val="000000"/>
+                <w:kern w:val="0"/>
+                <w:sz w:val="22"/>
+                <w:szCs w:val="22"/>
+                <w14:ligatures w14:val="none"/>
+              </w:rPr>
+              <w:t>-1.16***</w:t>
+            </w:r>
           </w:p>
         </w:tc>
       </w:tr>
       <w:tr>
         <w:trPr>
-          <w:gridAfter w:val="2"/>
-          <w:wAfter w:w="3262" w:type="dxa"/>
-          <w:trHeight w:val="327"/>
+          <w:trHeight w:val="288"/>
           <w:jc w:val="center"/>
         </w:trPr>
         <w:tc>
           <w:tcPr>
-            <w:tcW w:w="1617" w:type="dxa"/>
-            <w:tcBorders>
-              <w:bottom w:val="single" w:sz="4" w:space="0" w:color="auto"/>
-            </w:tcBorders>
-          </w:tcPr>
-          <w:p>
-            <w:pPr>
-              <w:jc w:val="both"/>
-              <w:rPr>
-                <w:rFonts w:ascii="Times New Roman" w:hAnsi="Times New Roman" w:cs="Times New Roman"/>
-                <w:noProof/>
-              </w:rPr>
-            </w:pPr>
-          </w:p>
-        </w:tc>
-        <w:tc>
-          <w:tcPr>
-            <w:tcW w:w="1523" w:type="dxa"/>
-            <w:tcBorders>
-              <w:bottom w:val="single" w:sz="4" w:space="0" w:color="auto"/>
-            </w:tcBorders>
+            <w:tcW w:w="1129" w:type="dxa"/>
+            <w:vMerge/>
+            <w:shd w:val="clear" w:color="auto" w:fill="auto"/>
             <w:vAlign w:val="center"/>
+            <w:hideMark/>
           </w:tcPr>
           <w:p>
             <w:pPr>
               <w:jc w:val="center"/>
               <w:rPr>
-                <w:rFonts w:ascii="Times New Roman" w:hAnsi="Times New Roman" w:cs="Times New Roman"/>
-                <w:noProof/>
+                <w:rFonts w:ascii="Times New Roman" w:eastAsia="Times New Roman" w:hAnsi="Times New Roman" w:cs="Times New Roman"/>
+                <w:kern w:val="0"/>
+                <w:sz w:val="20"/>
+                <w:szCs w:val="20"/>
+                <w14:ligatures w14:val="none"/>
+              </w:rPr>
+            </w:pPr>
+          </w:p>
+        </w:tc>
+        <w:tc>
+          <w:tcPr>
+            <w:tcW w:w="1276" w:type="dxa"/>
+            <w:shd w:val="clear" w:color="auto" w:fill="auto"/>
+            <w:vAlign w:val="center"/>
+            <w:hideMark/>
+          </w:tcPr>
+          <w:p>
+            <w:pPr>
+              <w:jc w:val="center"/>
+              <w:rPr>
+                <w:rFonts w:ascii="Calibri" w:eastAsia="Times New Roman" w:hAnsi="Calibri" w:cs="Calibri"/>
+                <w:color w:val="000000"/>
+                <w:kern w:val="0"/>
+                <w:sz w:val="22"/>
+                <w:szCs w:val="22"/>
+                <w14:ligatures w14:val="none"/>
               </w:rPr>
             </w:pPr>
             <w:r>
               <w:rPr>
-                <w:rFonts w:ascii="Times New Roman" w:hAnsi="Times New Roman" w:cs="Times New Roman"/>
-                <w:noProof/>
-              </w:rPr>
-              <w:t>(</w:t>
+                <w:rFonts w:ascii="Calibri" w:eastAsia="Times New Roman" w:hAnsi="Calibri" w:cs="Calibri"/>
+                <w:color w:val="000000"/>
+                <w:kern w:val="0"/>
+                <w:sz w:val="22"/>
+                <w:szCs w:val="22"/>
+                <w14:ligatures w14:val="none"/>
+              </w:rPr>
+              <w:t>(0.122)</w:t>
             </w:r>
+          </w:p>
+        </w:tc>
+        <w:tc>
+          <w:tcPr>
+            <w:tcW w:w="1418" w:type="dxa"/>
+            <w:shd w:val="clear" w:color="auto" w:fill="auto"/>
+            <w:vAlign w:val="center"/>
+            <w:hideMark/>
+          </w:tcPr>
+          <w:p>
+            <w:pPr>
+              <w:jc w:val="center"/>
+              <w:rPr>
+                <w:rFonts w:ascii="Calibri" w:eastAsia="Times New Roman" w:hAnsi="Calibri" w:cs="Calibri"/>
+                <w:color w:val="000000"/>
+                <w:kern w:val="0"/>
+                <w:sz w:val="22"/>
+                <w:szCs w:val="22"/>
+                <w14:ligatures w14:val="none"/>
+              </w:rPr>
+            </w:pPr>
             <w:r>
               <w:rPr>
-                <w:rFonts w:ascii="Times New Roman" w:hAnsi="Times New Roman" w:cs="Times New Roman"/>
-                <w:noProof/>
-              </w:rPr>
-              <w:t>0.125</w:t>
+                <w:rFonts w:ascii="Calibri" w:eastAsia="Times New Roman" w:hAnsi="Calibri" w:cs="Calibri"/>
+                <w:color w:val="000000"/>
+                <w:kern w:val="0"/>
+                <w:sz w:val="22"/>
+                <w:szCs w:val="22"/>
+                <w14:ligatures w14:val="none"/>
+              </w:rPr>
+              <w:t>(0.130)</w:t>
             </w:r>
+          </w:p>
+        </w:tc>
+        <w:tc>
+          <w:tcPr>
+            <w:tcW w:w="1357" w:type="dxa"/>
+            <w:shd w:val="clear" w:color="auto" w:fill="auto"/>
+            <w:vAlign w:val="center"/>
+            <w:hideMark/>
+          </w:tcPr>
+          <w:p>
+            <w:pPr>
+              <w:jc w:val="center"/>
+              <w:rPr>
+                <w:rFonts w:ascii="Calibri" w:eastAsia="Times New Roman" w:hAnsi="Calibri" w:cs="Calibri"/>
+                <w:color w:val="000000"/>
+                <w:kern w:val="0"/>
+                <w:sz w:val="22"/>
+                <w:szCs w:val="22"/>
+                <w14:ligatures w14:val="none"/>
+              </w:rPr>
+            </w:pPr>
             <w:r>
               <w:rPr>
-                <w:rFonts w:ascii="Times New Roman" w:hAnsi="Times New Roman" w:cs="Times New Roman"/>
-                <w:noProof/>
-              </w:rPr>
-              <w:t>)</w:t>
-            </w:r>
-          </w:p>
-        </w:tc>
-        <w:tc>
-          <w:tcPr>
-            <w:tcW w:w="1312" w:type="dxa"/>
-            <w:tcBorders>
-              <w:bottom w:val="single" w:sz="4" w:space="0" w:color="auto"/>
-            </w:tcBorders>
-            <w:vAlign w:val="center"/>
-          </w:tcPr>
-          <w:p>
-            <w:pPr>
-              <w:jc w:val="center"/>
-              <w:rPr>
-                <w:rFonts w:ascii="Times New Roman" w:hAnsi="Times New Roman" w:cs="Times New Roman"/>
-                <w:noProof/>
-              </w:rPr>
-            </w:pPr>
-            <w:r>
-              <w:rPr>
-                <w:rFonts w:ascii="Times New Roman" w:hAnsi="Times New Roman" w:cs="Times New Roman"/>
-                <w:noProof/>
+                <w:rFonts w:ascii="Calibri" w:eastAsia="Times New Roman" w:hAnsi="Calibri" w:cs="Calibri"/>
+                <w:color w:val="000000"/>
+                <w:kern w:val="0"/>
+                <w:sz w:val="22"/>
+                <w:szCs w:val="22"/>
+                <w14:ligatures w14:val="none"/>
               </w:rPr>
               <w:t>(0.13)</w:t>
             </w:r>
-          </w:p>
-        </w:tc>
-        <w:tc>
-          <w:tcPr>
-            <w:tcW w:w="1312" w:type="dxa"/>
-            <w:tcBorders>
-              <w:bottom w:val="single" w:sz="4" w:space="0" w:color="auto"/>
-            </w:tcBorders>
-          </w:tcPr>
-          <w:p>
-            <w:pPr>
-              <w:jc w:val="center"/>
-              <w:rPr>
-                <w:rFonts w:ascii="Times New Roman" w:hAnsi="Times New Roman" w:cs="Times New Roman"/>
-                <w:noProof/>
-              </w:rPr>
-            </w:pPr>
           </w:p>
         </w:tc>
       </w:tr>
       <w:tr>
         <w:trPr>
+          <w:trHeight w:val="58"/>
           <w:jc w:val="center"/>
         </w:trPr>
         <w:tc>
           <w:tcPr>
-            <w:tcW w:w="1617" w:type="dxa"/>
-            <w:tcBorders>
-              <w:top w:val="single" w:sz="4" w:space="0" w:color="auto"/>
-              <w:bottom w:val="single" w:sz="4" w:space="0" w:color="auto"/>
-            </w:tcBorders>
+            <w:tcW w:w="1129" w:type="dxa"/>
+            <w:vMerge w:val="restart"/>
+            <w:shd w:val="clear" w:color="auto" w:fill="auto"/>
             <w:vAlign w:val="center"/>
-          </w:tcPr>
-          <w:p>
-            <w:pPr>
-              <w:jc w:val="center"/>
-              <w:rPr>
-                <w:rFonts w:ascii="Times New Roman" w:hAnsi="Times New Roman" w:cs="Times New Roman"/>
-                <w:i/>
-                <w:noProof/>
+            <w:hideMark/>
+          </w:tcPr>
+          <w:p>
+            <w:pPr>
+              <w:rPr>
+                <w:rFonts w:ascii="Calibri" w:eastAsia="Times New Roman" w:hAnsi="Calibri" w:cs="Calibri"/>
+                <w:color w:val="000000"/>
+                <w:kern w:val="0"/>
+                <w:sz w:val="22"/>
+                <w:szCs w:val="22"/>
+                <w14:ligatures w14:val="none"/>
               </w:rPr>
             </w:pPr>
             <w:r>
               <w:rPr>
-                <w:rFonts w:ascii="Times New Roman" w:hAnsi="Times New Roman" w:cs="Times New Roman"/>
-                <w:i/>
-                <w:noProof/>
-              </w:rPr>
-              <w:t>Sample</w:t>
-            </w:r>
-            <w:r>
-              <w:rPr>
-                <w:rFonts w:ascii="Times New Roman" w:hAnsi="Times New Roman" w:cs="Times New Roman"/>
-                <w:i/>
-                <w:noProof/>
-              </w:rPr>
-              <w:t>s</w:t>
-            </w:r>
-          </w:p>
-          <w:p>
-            <w:pPr>
-              <w:jc w:val="center"/>
-              <w:rPr>
-                <w:rFonts w:ascii="Times New Roman" w:hAnsi="Times New Roman" w:cs="Times New Roman"/>
-                <w:i/>
-                <w:noProof/>
-              </w:rPr>
-            </w:pPr>
-            <w:r>
-              <w:rPr>
-                <w:rFonts w:ascii="Times New Roman" w:hAnsi="Times New Roman" w:cs="Times New Roman"/>
-                <w:i/>
-                <w:noProof/>
-              </w:rPr>
-              <w:t>decomposition</w:t>
-            </w:r>
-          </w:p>
-        </w:tc>
-        <w:tc>
-          <w:tcPr>
-            <w:tcW w:w="1523" w:type="dxa"/>
-            <w:tcBorders>
-              <w:top w:val="single" w:sz="4" w:space="0" w:color="auto"/>
-              <w:bottom w:val="single" w:sz="4" w:space="0" w:color="auto"/>
-            </w:tcBorders>
-            <w:vAlign w:val="center"/>
-          </w:tcPr>
-          <w:p>
-            <w:pPr>
-              <w:jc w:val="center"/>
-              <w:rPr>
-                <w:rFonts w:ascii="Times New Roman" w:hAnsi="Times New Roman" w:cs="Times New Roman"/>
-                <w:b/>
-                <w:noProof/>
-              </w:rPr>
-            </w:pPr>
-            <w:r>
-              <w:rPr>
-                <w:rFonts w:ascii="Times New Roman" w:hAnsi="Times New Roman" w:cs="Times New Roman"/>
-                <w:b/>
-                <w:noProof/>
-              </w:rPr>
-              <w:t>Own synthetic group</w:t>
-            </w:r>
-          </w:p>
-        </w:tc>
-        <w:tc>
-          <w:tcPr>
-            <w:tcW w:w="1312" w:type="dxa"/>
-            <w:tcBorders>
-              <w:top w:val="single" w:sz="4" w:space="0" w:color="auto"/>
-              <w:bottom w:val="single" w:sz="4" w:space="0" w:color="auto"/>
-            </w:tcBorders>
-            <w:vAlign w:val="center"/>
-          </w:tcPr>
-          <w:p>
-            <w:pPr>
-              <w:jc w:val="center"/>
-              <w:rPr>
-                <w:rFonts w:ascii="Times New Roman" w:hAnsi="Times New Roman" w:cs="Times New Roman"/>
-                <w:b/>
-                <w:noProof/>
-                <w:lang w:val="bg-BG"/>
-              </w:rPr>
-            </w:pPr>
-            <w:r>
-              <w:rPr>
-                <w:rFonts w:ascii="Times New Roman" w:hAnsi="Times New Roman" w:cs="Times New Roman"/>
-                <w:b/>
-                <w:noProof/>
-              </w:rPr>
-              <w:t>Poor countries</w:t>
-            </w:r>
-          </w:p>
-        </w:tc>
-        <w:tc>
-          <w:tcPr>
-            <w:tcW w:w="1312" w:type="dxa"/>
-            <w:tcBorders>
-              <w:top w:val="single" w:sz="4" w:space="0" w:color="auto"/>
-              <w:bottom w:val="single" w:sz="4" w:space="0" w:color="auto"/>
-            </w:tcBorders>
-          </w:tcPr>
-          <w:p>
-            <w:pPr>
-              <w:jc w:val="center"/>
-              <w:rPr>
-                <w:rFonts w:ascii="Times New Roman" w:hAnsi="Times New Roman" w:cs="Times New Roman"/>
-                <w:b/>
-                <w:noProof/>
-              </w:rPr>
-            </w:pPr>
-            <w:r>
-              <w:rPr>
-                <w:rFonts w:ascii="Times New Roman" w:hAnsi="Times New Roman" w:cs="Times New Roman"/>
-                <w:b/>
-                <w:noProof/>
-              </w:rPr>
-              <w:t>Rich countries</w:t>
-            </w:r>
-          </w:p>
-        </w:tc>
-        <w:tc>
-          <w:tcPr>
-            <w:tcW w:w="1672" w:type="dxa"/>
-            <w:tcBorders>
-              <w:top w:val="single" w:sz="4" w:space="0" w:color="auto"/>
-              <w:bottom w:val="single" w:sz="4" w:space="0" w:color="auto"/>
-            </w:tcBorders>
-            <w:vAlign w:val="center"/>
-          </w:tcPr>
-          <w:p>
-            <w:pPr>
-              <w:jc w:val="center"/>
-              <w:rPr>
-                <w:rFonts w:ascii="Times New Roman" w:hAnsi="Times New Roman" w:cs="Times New Roman"/>
-                <w:b/>
-                <w:noProof/>
-                <w:lang w:val="bg-BG"/>
-              </w:rPr>
-            </w:pPr>
-            <w:r>
-              <w:rPr>
-                <w:rFonts w:ascii="Times New Roman" w:hAnsi="Times New Roman" w:cs="Times New Roman"/>
-                <w:b/>
-                <w:noProof/>
+                <w:rFonts w:ascii="Calibri" w:eastAsia="Times New Roman" w:hAnsi="Calibri" w:cs="Calibri"/>
+                <w:color w:val="000000"/>
+                <w:kern w:val="0"/>
+                <w:sz w:val="22"/>
+                <w:szCs w:val="22"/>
+                <w14:ligatures w14:val="none"/>
               </w:rPr>
               <w:t>OECD countries</w:t>
             </w:r>
@@ -12394,240 +12333,783 @@
         </w:tc>
         <w:tc>
           <w:tcPr>
-            <w:tcW w:w="1590" w:type="dxa"/>
-            <w:tcBorders>
-              <w:top w:val="single" w:sz="4" w:space="0" w:color="auto"/>
-              <w:bottom w:val="single" w:sz="4" w:space="0" w:color="auto"/>
-            </w:tcBorders>
+            <w:tcW w:w="1276" w:type="dxa"/>
+            <w:shd w:val="clear" w:color="auto" w:fill="auto"/>
             <w:vAlign w:val="center"/>
+            <w:hideMark/>
           </w:tcPr>
           <w:p>
             <w:pPr>
               <w:jc w:val="center"/>
               <w:rPr>
-                <w:rFonts w:ascii="Times New Roman" w:hAnsi="Times New Roman" w:cs="Times New Roman"/>
-                <w:b/>
-                <w:noProof/>
-                <w:lang w:val="bg-BG"/>
-              </w:rPr>
-            </w:pPr>
+                <w:rFonts w:ascii="Calibri" w:eastAsia="Times New Roman" w:hAnsi="Calibri" w:cs="Calibri"/>
+                <w:color w:val="000000"/>
+                <w:kern w:val="0"/>
+                <w:sz w:val="22"/>
+                <w:szCs w:val="22"/>
+                <w14:ligatures w14:val="none"/>
+              </w:rPr>
+            </w:pPr>
+            <w:r>
+              <w:rPr>
+                <w:rFonts w:ascii="Calibri" w:eastAsia="Times New Roman" w:hAnsi="Calibri" w:cs="Calibri"/>
+                <w:color w:val="000000"/>
+                <w:kern w:val="0"/>
+                <w:sz w:val="22"/>
+                <w:szCs w:val="22"/>
+                <w14:ligatures w14:val="none"/>
+              </w:rPr>
+              <w:t>−1.18*</w:t>
+            </w:r>
+          </w:p>
+        </w:tc>
+        <w:tc>
+          <w:tcPr>
+            <w:tcW w:w="1418" w:type="dxa"/>
+            <w:shd w:val="clear" w:color="auto" w:fill="auto"/>
+            <w:vAlign w:val="center"/>
+            <w:hideMark/>
+          </w:tcPr>
+          <w:p>
+            <w:pPr>
+              <w:jc w:val="center"/>
+              <w:rPr>
+                <w:rFonts w:ascii="Calibri" w:eastAsia="Times New Roman" w:hAnsi="Calibri" w:cs="Calibri"/>
+                <w:color w:val="000000"/>
+                <w:kern w:val="0"/>
+                <w:sz w:val="22"/>
+                <w:szCs w:val="22"/>
+                <w14:ligatures w14:val="none"/>
+              </w:rPr>
+            </w:pPr>
+            <w:r>
+              <w:rPr>
+                <w:rFonts w:ascii="Calibri" w:eastAsia="Times New Roman" w:hAnsi="Calibri" w:cs="Calibri"/>
+                <w:color w:val="000000"/>
+                <w:kern w:val="0"/>
+                <w:sz w:val="22"/>
+                <w:szCs w:val="22"/>
+                <w14:ligatures w14:val="none"/>
+              </w:rPr>
+              <w:t>−1.26***</w:t>
+            </w:r>
+          </w:p>
+        </w:tc>
+        <w:tc>
+          <w:tcPr>
+            <w:tcW w:w="1357" w:type="dxa"/>
+            <w:shd w:val="clear" w:color="auto" w:fill="auto"/>
+            <w:vAlign w:val="center"/>
+            <w:hideMark/>
+          </w:tcPr>
+          <w:p>
+            <w:pPr>
+              <w:jc w:val="center"/>
+              <w:rPr>
+                <w:rFonts w:ascii="Calibri" w:eastAsia="Times New Roman" w:hAnsi="Calibri" w:cs="Calibri"/>
+                <w:color w:val="000000"/>
+                <w:kern w:val="0"/>
+                <w:sz w:val="22"/>
+                <w:szCs w:val="22"/>
+                <w14:ligatures w14:val="none"/>
+              </w:rPr>
+            </w:pPr>
+            <w:r>
+              <w:rPr>
+                <w:rFonts w:ascii="Calibri" w:eastAsia="Times New Roman" w:hAnsi="Calibri" w:cs="Calibri"/>
+                <w:color w:val="000000"/>
+                <w:kern w:val="0"/>
+                <w:sz w:val="22"/>
+                <w:szCs w:val="22"/>
+                <w14:ligatures w14:val="none"/>
+              </w:rPr>
+              <w:t>-1.198***</w:t>
+            </w:r>
           </w:p>
         </w:tc>
       </w:tr>
       <w:tr>
         <w:trPr>
+          <w:trHeight w:val="288"/>
           <w:jc w:val="center"/>
         </w:trPr>
         <w:tc>
           <w:tcPr>
-            <w:tcW w:w="1617" w:type="dxa"/>
-            <w:tcBorders>
-              <w:top w:val="single" w:sz="4" w:space="0" w:color="auto"/>
-            </w:tcBorders>
-          </w:tcPr>
-          <w:p>
-            <w:pPr>
-              <w:jc w:val="both"/>
-              <w:rPr>
-                <w:rFonts w:ascii="Times New Roman" w:hAnsi="Times New Roman" w:cs="Times New Roman"/>
-                <w:noProof/>
+            <w:tcW w:w="1129" w:type="dxa"/>
+            <w:vMerge/>
+            <w:shd w:val="clear" w:color="auto" w:fill="auto"/>
+            <w:vAlign w:val="center"/>
+            <w:hideMark/>
+          </w:tcPr>
+          <w:p>
+            <w:pPr>
+              <w:jc w:val="center"/>
+              <w:rPr>
+                <w:rFonts w:ascii="Times New Roman" w:eastAsia="Times New Roman" w:hAnsi="Times New Roman" w:cs="Times New Roman"/>
+                <w:kern w:val="0"/>
+                <w:sz w:val="20"/>
+                <w:szCs w:val="20"/>
+                <w14:ligatures w14:val="none"/>
+              </w:rPr>
+            </w:pPr>
+          </w:p>
+        </w:tc>
+        <w:tc>
+          <w:tcPr>
+            <w:tcW w:w="1276" w:type="dxa"/>
+            <w:shd w:val="clear" w:color="auto" w:fill="auto"/>
+            <w:vAlign w:val="center"/>
+            <w:hideMark/>
+          </w:tcPr>
+          <w:p>
+            <w:pPr>
+              <w:jc w:val="center"/>
+              <w:rPr>
+                <w:rFonts w:ascii="Calibri" w:eastAsia="Times New Roman" w:hAnsi="Calibri" w:cs="Calibri"/>
+                <w:color w:val="000000"/>
+                <w:kern w:val="0"/>
+                <w:sz w:val="22"/>
+                <w:szCs w:val="22"/>
+                <w14:ligatures w14:val="none"/>
               </w:rPr>
             </w:pPr>
             <w:r>
               <w:rPr>
-                <w:rFonts w:ascii="Times New Roman" w:hAnsi="Times New Roman" w:cs="Times New Roman"/>
-                <w:noProof/>
-              </w:rPr>
-              <w:t xml:space="preserve">Control group </w:t>
+                <w:rFonts w:ascii="Calibri" w:eastAsia="Times New Roman" w:hAnsi="Calibri" w:cs="Calibri"/>
+                <w:color w:val="000000"/>
+                <w:kern w:val="0"/>
+                <w:sz w:val="22"/>
+                <w:szCs w:val="22"/>
+                <w14:ligatures w14:val="none"/>
+              </w:rPr>
+              <w:t>(0.125)</w:t>
             </w:r>
           </w:p>
         </w:tc>
         <w:tc>
           <w:tcPr>
-            <w:tcW w:w="1523" w:type="dxa"/>
-            <w:tcBorders>
-              <w:top w:val="single" w:sz="4" w:space="0" w:color="auto"/>
-            </w:tcBorders>
+            <w:tcW w:w="1418" w:type="dxa"/>
+            <w:shd w:val="clear" w:color="auto" w:fill="auto"/>
+            <w:vAlign w:val="center"/>
+            <w:hideMark/>
           </w:tcPr>
           <w:p>
             <w:pPr>
               <w:jc w:val="center"/>
               <w:rPr>
-                <w:rFonts w:ascii="Times New Roman" w:hAnsi="Times New Roman" w:cs="Times New Roman"/>
-                <w:noProof/>
+                <w:rFonts w:ascii="Calibri" w:eastAsia="Times New Roman" w:hAnsi="Calibri" w:cs="Calibri"/>
+                <w:color w:val="000000"/>
+                <w:kern w:val="0"/>
+                <w:sz w:val="22"/>
+                <w:szCs w:val="22"/>
+                <w14:ligatures w14:val="none"/>
               </w:rPr>
             </w:pPr>
             <w:r>
               <w:rPr>
-                <w:rFonts w:ascii="Times New Roman" w:hAnsi="Times New Roman" w:cs="Times New Roman"/>
-                <w:noProof/>
-              </w:rPr>
-              <w:t>24</w:t>
+                <w:rFonts w:ascii="Calibri" w:eastAsia="Times New Roman" w:hAnsi="Calibri" w:cs="Calibri"/>
+                <w:color w:val="000000"/>
+                <w:kern w:val="0"/>
+                <w:sz w:val="22"/>
+                <w:szCs w:val="22"/>
+                <w14:ligatures w14:val="none"/>
+              </w:rPr>
+              <w:t>(0.130)</w:t>
             </w:r>
           </w:p>
         </w:tc>
         <w:tc>
           <w:tcPr>
-            <w:tcW w:w="1312" w:type="dxa"/>
-            <w:tcBorders>
-              <w:top w:val="single" w:sz="4" w:space="0" w:color="auto"/>
-            </w:tcBorders>
+            <w:tcW w:w="1357" w:type="dxa"/>
+            <w:shd w:val="clear" w:color="auto" w:fill="auto"/>
+            <w:vAlign w:val="center"/>
+            <w:hideMark/>
           </w:tcPr>
           <w:p>
             <w:pPr>
               <w:jc w:val="center"/>
               <w:rPr>
-                <w:rFonts w:ascii="Times New Roman" w:hAnsi="Times New Roman" w:cs="Times New Roman"/>
-                <w:noProof/>
+                <w:rFonts w:ascii="Calibri" w:eastAsia="Times New Roman" w:hAnsi="Calibri" w:cs="Calibri"/>
+                <w:color w:val="000000"/>
+                <w:kern w:val="0"/>
+                <w:sz w:val="22"/>
+                <w:szCs w:val="22"/>
+                <w14:ligatures w14:val="none"/>
               </w:rPr>
             </w:pPr>
             <w:r>
               <w:rPr>
-                <w:rFonts w:ascii="Times New Roman" w:hAnsi="Times New Roman" w:cs="Times New Roman"/>
-                <w:noProof/>
-              </w:rPr>
-              <w:t>14</w:t>
+                <w:rFonts w:ascii="Calibri" w:eastAsia="Times New Roman" w:hAnsi="Calibri" w:cs="Calibri"/>
+                <w:color w:val="000000"/>
+                <w:kern w:val="0"/>
+                <w:sz w:val="22"/>
+                <w:szCs w:val="22"/>
+                <w14:ligatures w14:val="none"/>
+              </w:rPr>
+              <w:t>(0.13)</w:t>
             </w:r>
           </w:p>
         </w:tc>
-        <w:tc>
-          <w:tcPr>
-            <w:tcW w:w="1312" w:type="dxa"/>
-            <w:tcBorders>
-              <w:top w:val="single" w:sz="4" w:space="0" w:color="auto"/>
-            </w:tcBorders>
+      </w:tr>
+    </w:tbl>
+    <w:p>
+      <w:pPr>
+        <w:jc w:val="both"/>
+        <w:rPr>
+          <w:rFonts w:ascii="Times New Roman" w:hAnsi="Times New Roman" w:cs="Times New Roman"/>
+          <w:noProof/>
+        </w:rPr>
+      </w:pPr>
+    </w:p>
+    <w:tbl>
+      <w:tblPr>
+        <w:tblW w:w="6140" w:type="dxa"/>
+        <w:jc w:val="center"/>
+        <w:tblBorders>
+          <w:top w:val="single" w:sz="4" w:space="0" w:color="auto"/>
+          <w:left w:val="single" w:sz="4" w:space="0" w:color="auto"/>
+          <w:bottom w:val="single" w:sz="4" w:space="0" w:color="auto"/>
+          <w:right w:val="single" w:sz="4" w:space="0" w:color="auto"/>
+          <w:insideH w:val="single" w:sz="4" w:space="0" w:color="auto"/>
+          <w:insideV w:val="single" w:sz="4" w:space="0" w:color="auto"/>
+        </w:tblBorders>
+        <w:tblLook w:val="04A0" w:firstRow="1" w:lastRow="0" w:firstColumn="1" w:lastColumn="0" w:noHBand="0" w:noVBand="1"/>
+      </w:tblPr>
+      <w:tblGrid>
+        <w:gridCol w:w="2020"/>
+        <w:gridCol w:w="1300"/>
+        <w:gridCol w:w="900"/>
+        <w:gridCol w:w="960"/>
+        <w:gridCol w:w="960"/>
+      </w:tblGrid>
+      <w:tr>
+        <w:trPr>
+          <w:trHeight w:val="288"/>
+          <w:jc w:val="center"/>
+        </w:trPr>
+        <w:tc>
+          <w:tcPr>
+            <w:tcW w:w="2020" w:type="dxa"/>
+            <w:shd w:val="clear" w:color="auto" w:fill="auto"/>
+            <w:vAlign w:val="center"/>
+            <w:hideMark/>
+          </w:tcPr>
+          <w:p>
+            <w:pPr>
+              <w:rPr>
+                <w:rFonts w:ascii="Times New Roman" w:eastAsia="Times New Roman" w:hAnsi="Times New Roman" w:cs="Times New Roman"/>
+                <w:kern w:val="0"/>
+                <w14:ligatures w14:val="none"/>
+              </w:rPr>
+            </w:pPr>
+          </w:p>
+        </w:tc>
+        <w:tc>
+          <w:tcPr>
+            <w:tcW w:w="1300" w:type="dxa"/>
+            <w:shd w:val="clear" w:color="auto" w:fill="auto"/>
+            <w:vAlign w:val="center"/>
+            <w:hideMark/>
           </w:tcPr>
           <w:p>
             <w:pPr>
               <w:jc w:val="center"/>
               <w:rPr>
-                <w:rFonts w:ascii="Times New Roman" w:hAnsi="Times New Roman" w:cs="Times New Roman"/>
-                <w:noProof/>
+                <w:rFonts w:ascii="Calibri" w:eastAsia="Times New Roman" w:hAnsi="Calibri" w:cs="Calibri"/>
+                <w:b/>
+                <w:bCs/>
+                <w:color w:val="000000"/>
+                <w:kern w:val="0"/>
+                <w:sz w:val="22"/>
+                <w:szCs w:val="22"/>
+                <w14:ligatures w14:val="none"/>
               </w:rPr>
             </w:pPr>
             <w:r>
               <w:rPr>
-                <w:rFonts w:ascii="Times New Roman" w:hAnsi="Times New Roman" w:cs="Times New Roman"/>
-                <w:noProof/>
-              </w:rPr>
-              <w:t>13</w:t>
+                <w:rFonts w:ascii="Calibri" w:eastAsia="Times New Roman" w:hAnsi="Calibri" w:cs="Calibri"/>
+                <w:b/>
+                <w:bCs/>
+                <w:color w:val="000000"/>
+                <w:kern w:val="0"/>
+                <w:sz w:val="22"/>
+                <w:szCs w:val="22"/>
+                <w14:ligatures w14:val="none"/>
+              </w:rPr>
+              <w:t>Synthetic</w:t>
             </w:r>
           </w:p>
         </w:tc>
         <w:tc>
           <w:tcPr>
-            <w:tcW w:w="1672" w:type="dxa"/>
-            <w:tcBorders>
-              <w:top w:val="single" w:sz="4" w:space="0" w:color="auto"/>
-            </w:tcBorders>
+            <w:tcW w:w="900" w:type="dxa"/>
+            <w:shd w:val="clear" w:color="auto" w:fill="auto"/>
+            <w:vAlign w:val="center"/>
+            <w:hideMark/>
           </w:tcPr>
           <w:p>
             <w:pPr>
               <w:jc w:val="center"/>
               <w:rPr>
-                <w:rFonts w:ascii="Times New Roman" w:hAnsi="Times New Roman" w:cs="Times New Roman"/>
-                <w:noProof/>
+                <w:rFonts w:ascii="Calibri" w:eastAsia="Times New Roman" w:hAnsi="Calibri" w:cs="Calibri"/>
+                <w:b/>
+                <w:bCs/>
+                <w:color w:val="000000"/>
+                <w:kern w:val="0"/>
+                <w:sz w:val="22"/>
+                <w:szCs w:val="22"/>
+                <w14:ligatures w14:val="none"/>
               </w:rPr>
             </w:pPr>
             <w:r>
               <w:rPr>
-                <w:rFonts w:ascii="Times New Roman" w:hAnsi="Times New Roman" w:cs="Times New Roman"/>
-                <w:noProof/>
-              </w:rPr>
-              <w:t>14</w:t>
+                <w:rFonts w:ascii="Calibri" w:eastAsia="Times New Roman" w:hAnsi="Calibri" w:cs="Calibri"/>
+                <w:b/>
+                <w:bCs/>
+                <w:color w:val="000000"/>
+                <w:kern w:val="0"/>
+                <w:sz w:val="22"/>
+                <w:szCs w:val="22"/>
+                <w14:ligatures w14:val="none"/>
+              </w:rPr>
+              <w:t>Poor</w:t>
             </w:r>
           </w:p>
         </w:tc>
         <w:tc>
           <w:tcPr>
-            <w:tcW w:w="1590" w:type="dxa"/>
-            <w:tcBorders>
-              <w:top w:val="single" w:sz="4" w:space="0" w:color="auto"/>
-            </w:tcBorders>
+            <w:tcW w:w="960" w:type="dxa"/>
+            <w:shd w:val="clear" w:color="auto" w:fill="auto"/>
+            <w:vAlign w:val="center"/>
+            <w:hideMark/>
           </w:tcPr>
           <w:p>
             <w:pPr>
               <w:jc w:val="center"/>
               <w:rPr>
-                <w:rFonts w:ascii="Times New Roman" w:hAnsi="Times New Roman" w:cs="Times New Roman"/>
-                <w:noProof/>
-              </w:rPr>
-            </w:pPr>
+                <w:rFonts w:ascii="Calibri" w:eastAsia="Times New Roman" w:hAnsi="Calibri" w:cs="Calibri"/>
+                <w:b/>
+                <w:bCs/>
+                <w:color w:val="000000"/>
+                <w:kern w:val="0"/>
+                <w:sz w:val="22"/>
+                <w:szCs w:val="22"/>
+                <w14:ligatures w14:val="none"/>
+              </w:rPr>
+            </w:pPr>
+            <w:r>
+              <w:rPr>
+                <w:rFonts w:ascii="Calibri" w:eastAsia="Times New Roman" w:hAnsi="Calibri" w:cs="Calibri"/>
+                <w:b/>
+                <w:bCs/>
+                <w:color w:val="000000"/>
+                <w:kern w:val="0"/>
+                <w:sz w:val="22"/>
+                <w:szCs w:val="22"/>
+                <w14:ligatures w14:val="none"/>
+              </w:rPr>
+              <w:t>Rich</w:t>
+            </w:r>
+          </w:p>
+        </w:tc>
+        <w:tc>
+          <w:tcPr>
+            <w:tcW w:w="960" w:type="dxa"/>
+            <w:shd w:val="clear" w:color="auto" w:fill="auto"/>
+            <w:vAlign w:val="center"/>
+            <w:hideMark/>
+          </w:tcPr>
+          <w:p>
+            <w:pPr>
+              <w:jc w:val="center"/>
+              <w:rPr>
+                <w:rFonts w:ascii="Calibri" w:eastAsia="Times New Roman" w:hAnsi="Calibri" w:cs="Calibri"/>
+                <w:b/>
+                <w:bCs/>
+                <w:color w:val="000000"/>
+                <w:kern w:val="0"/>
+                <w:sz w:val="22"/>
+                <w:szCs w:val="22"/>
+                <w14:ligatures w14:val="none"/>
+              </w:rPr>
+            </w:pPr>
+            <w:r>
+              <w:rPr>
+                <w:rFonts w:ascii="Calibri" w:eastAsia="Times New Roman" w:hAnsi="Calibri" w:cs="Calibri"/>
+                <w:b/>
+                <w:bCs/>
+                <w:color w:val="000000"/>
+                <w:kern w:val="0"/>
+                <w:sz w:val="22"/>
+                <w:szCs w:val="22"/>
+                <w14:ligatures w14:val="none"/>
+              </w:rPr>
+              <w:t>OECD</w:t>
+            </w:r>
           </w:p>
         </w:tc>
       </w:tr>
       <w:tr>
         <w:trPr>
+          <w:trHeight w:val="123"/>
           <w:jc w:val="center"/>
         </w:trPr>
         <w:tc>
           <w:tcPr>
-            <w:tcW w:w="1617" w:type="dxa"/>
-          </w:tcPr>
-          <w:p>
-            <w:pPr>
-              <w:jc w:val="both"/>
-              <w:rPr>
-                <w:rFonts w:ascii="Times New Roman" w:hAnsi="Times New Roman" w:cs="Times New Roman"/>
-                <w:noProof/>
+            <w:tcW w:w="2020" w:type="dxa"/>
+            <w:shd w:val="clear" w:color="auto" w:fill="auto"/>
+            <w:vAlign w:val="center"/>
+            <w:hideMark/>
+          </w:tcPr>
+          <w:p>
+            <w:pPr>
+              <w:rPr>
+                <w:rFonts w:ascii="Calibri" w:eastAsia="Times New Roman" w:hAnsi="Calibri" w:cs="Calibri"/>
+                <w:color w:val="000000"/>
+                <w:kern w:val="0"/>
+                <w:sz w:val="22"/>
+                <w:szCs w:val="22"/>
+                <w14:ligatures w14:val="none"/>
               </w:rPr>
             </w:pPr>
             <w:r>
               <w:rPr>
-                <w:rFonts w:ascii="Times New Roman" w:hAnsi="Times New Roman" w:cs="Times New Roman"/>
-                <w:noProof/>
-              </w:rPr>
-              <w:t>EU group</w:t>
+                <w:rFonts w:ascii="Calibri" w:eastAsia="Times New Roman" w:hAnsi="Calibri" w:cs="Calibri"/>
+                <w:color w:val="000000"/>
+                <w:kern w:val="0"/>
+                <w:sz w:val="22"/>
+                <w:szCs w:val="22"/>
+                <w14:ligatures w14:val="none"/>
+              </w:rPr>
+              <w:t>Control group</w:t>
             </w:r>
           </w:p>
         </w:tc>
         <w:tc>
           <w:tcPr>
-            <w:tcW w:w="7409" w:type="dxa"/>
-            <w:gridSpan w:val="5"/>
+            <w:tcW w:w="1300" w:type="dxa"/>
+            <w:shd w:val="clear" w:color="auto" w:fill="auto"/>
+            <w:vAlign w:val="center"/>
+            <w:hideMark/>
           </w:tcPr>
           <w:p>
             <w:pPr>
               <w:jc w:val="center"/>
               <w:rPr>
-                <w:rFonts w:ascii="Times New Roman" w:hAnsi="Times New Roman" w:cs="Times New Roman"/>
-                <w:noProof/>
+                <w:rFonts w:ascii="Calibri" w:eastAsia="Times New Roman" w:hAnsi="Calibri" w:cs="Calibri"/>
+                <w:color w:val="000000"/>
+                <w:kern w:val="0"/>
+                <w:sz w:val="22"/>
+                <w:szCs w:val="22"/>
+                <w14:ligatures w14:val="none"/>
               </w:rPr>
             </w:pPr>
             <w:r>
               <w:rPr>
-                <w:rFonts w:ascii="Times New Roman" w:hAnsi="Times New Roman" w:cs="Times New Roman"/>
-                <w:noProof/>
-              </w:rPr>
-              <w:t>26</w:t>
+                <w:rFonts w:ascii="Calibri" w:eastAsia="Times New Roman" w:hAnsi="Calibri" w:cs="Calibri"/>
+                <w:color w:val="000000"/>
+                <w:kern w:val="0"/>
+                <w:sz w:val="22"/>
+                <w:szCs w:val="22"/>
+                <w14:ligatures w14:val="none"/>
+              </w:rPr>
+              <w:t>24</w:t>
+            </w:r>
+          </w:p>
+        </w:tc>
+        <w:tc>
+          <w:tcPr>
+            <w:tcW w:w="900" w:type="dxa"/>
+            <w:shd w:val="clear" w:color="auto" w:fill="auto"/>
+            <w:vAlign w:val="center"/>
+            <w:hideMark/>
+          </w:tcPr>
+          <w:p>
+            <w:pPr>
+              <w:jc w:val="center"/>
+              <w:rPr>
+                <w:rFonts w:ascii="Calibri" w:eastAsia="Times New Roman" w:hAnsi="Calibri" w:cs="Calibri"/>
+                <w:color w:val="000000"/>
+                <w:kern w:val="0"/>
+                <w:sz w:val="22"/>
+                <w:szCs w:val="22"/>
+                <w14:ligatures w14:val="none"/>
+              </w:rPr>
+            </w:pPr>
+            <w:r>
+              <w:rPr>
+                <w:rFonts w:ascii="Calibri" w:eastAsia="Times New Roman" w:hAnsi="Calibri" w:cs="Calibri"/>
+                <w:color w:val="000000"/>
+                <w:kern w:val="0"/>
+                <w:sz w:val="22"/>
+                <w:szCs w:val="22"/>
+                <w14:ligatures w14:val="none"/>
+              </w:rPr>
+              <w:t>14</w:t>
+            </w:r>
+          </w:p>
+        </w:tc>
+        <w:tc>
+          <w:tcPr>
+            <w:tcW w:w="960" w:type="dxa"/>
+            <w:shd w:val="clear" w:color="auto" w:fill="auto"/>
+            <w:vAlign w:val="center"/>
+            <w:hideMark/>
+          </w:tcPr>
+          <w:p>
+            <w:pPr>
+              <w:jc w:val="center"/>
+              <w:rPr>
+                <w:rFonts w:ascii="Calibri" w:eastAsia="Times New Roman" w:hAnsi="Calibri" w:cs="Calibri"/>
+                <w:color w:val="000000"/>
+                <w:kern w:val="0"/>
+                <w:sz w:val="22"/>
+                <w:szCs w:val="22"/>
+                <w14:ligatures w14:val="none"/>
+              </w:rPr>
+            </w:pPr>
+            <w:r>
+              <w:rPr>
+                <w:rFonts w:ascii="Calibri" w:eastAsia="Times New Roman" w:hAnsi="Calibri" w:cs="Calibri"/>
+                <w:color w:val="000000"/>
+                <w:kern w:val="0"/>
+                <w:sz w:val="22"/>
+                <w:szCs w:val="22"/>
+                <w14:ligatures w14:val="none"/>
+              </w:rPr>
+              <w:t>13</w:t>
+            </w:r>
+          </w:p>
+        </w:tc>
+        <w:tc>
+          <w:tcPr>
+            <w:tcW w:w="960" w:type="dxa"/>
+            <w:shd w:val="clear" w:color="auto" w:fill="auto"/>
+            <w:vAlign w:val="center"/>
+            <w:hideMark/>
+          </w:tcPr>
+          <w:p>
+            <w:pPr>
+              <w:jc w:val="center"/>
+              <w:rPr>
+                <w:rFonts w:ascii="Calibri" w:eastAsia="Times New Roman" w:hAnsi="Calibri" w:cs="Calibri"/>
+                <w:color w:val="000000"/>
+                <w:kern w:val="0"/>
+                <w:sz w:val="22"/>
+                <w:szCs w:val="22"/>
+                <w14:ligatures w14:val="none"/>
+              </w:rPr>
+            </w:pPr>
+            <w:r>
+              <w:rPr>
+                <w:rFonts w:ascii="Calibri" w:eastAsia="Times New Roman" w:hAnsi="Calibri" w:cs="Calibri"/>
+                <w:color w:val="000000"/>
+                <w:kern w:val="0"/>
+                <w:sz w:val="22"/>
+                <w:szCs w:val="22"/>
+                <w14:ligatures w14:val="none"/>
+              </w:rPr>
+              <w:t>14</w:t>
             </w:r>
           </w:p>
         </w:tc>
       </w:tr>
       <w:tr>
         <w:trPr>
-          <w:trHeight w:val="83"/>
+          <w:trHeight w:val="288"/>
           <w:jc w:val="center"/>
         </w:trPr>
         <w:tc>
           <w:tcPr>
-            <w:tcW w:w="1617" w:type="dxa"/>
-            <w:tcBorders>
-              <w:bottom w:val="single" w:sz="4" w:space="0" w:color="auto"/>
-            </w:tcBorders>
-          </w:tcPr>
-          <w:p>
-            <w:pPr>
-              <w:jc w:val="both"/>
-              <w:rPr>
-                <w:rFonts w:ascii="Times New Roman" w:hAnsi="Times New Roman" w:cs="Times New Roman"/>
-                <w:noProof/>
+            <w:tcW w:w="2020" w:type="dxa"/>
+            <w:shd w:val="clear" w:color="auto" w:fill="auto"/>
+            <w:vAlign w:val="center"/>
+            <w:hideMark/>
+          </w:tcPr>
+          <w:p>
+            <w:pPr>
+              <w:rPr>
+                <w:rFonts w:ascii="Calibri" w:eastAsia="Times New Roman" w:hAnsi="Calibri" w:cs="Calibri"/>
+                <w:color w:val="000000"/>
+                <w:kern w:val="0"/>
+                <w:sz w:val="22"/>
+                <w:szCs w:val="22"/>
+                <w14:ligatures w14:val="none"/>
               </w:rPr>
             </w:pPr>
             <w:r>
               <w:rPr>
-                <w:rFonts w:ascii="Times New Roman" w:hAnsi="Times New Roman" w:cs="Times New Roman"/>
-                <w:noProof/>
+                <w:rFonts w:ascii="Calibri" w:eastAsia="Times New Roman" w:hAnsi="Calibri" w:cs="Calibri"/>
+                <w:color w:val="000000"/>
+                <w:kern w:val="0"/>
+                <w:sz w:val="22"/>
+                <w:szCs w:val="22"/>
+                <w14:ligatures w14:val="none"/>
+              </w:rPr>
+              <w:t>EU group</w:t>
+            </w:r>
+          </w:p>
+        </w:tc>
+        <w:tc>
+          <w:tcPr>
+            <w:tcW w:w="1300" w:type="dxa"/>
+            <w:shd w:val="clear" w:color="auto" w:fill="auto"/>
+            <w:vAlign w:val="center"/>
+            <w:hideMark/>
+          </w:tcPr>
+          <w:p>
+            <w:pPr>
+              <w:jc w:val="center"/>
+              <w:rPr>
+                <w:rFonts w:ascii="Calibri" w:eastAsia="Times New Roman" w:hAnsi="Calibri" w:cs="Calibri"/>
+                <w:color w:val="000000"/>
+                <w:kern w:val="0"/>
+                <w:sz w:val="22"/>
+                <w:szCs w:val="22"/>
+                <w14:ligatures w14:val="none"/>
+              </w:rPr>
+            </w:pPr>
+            <w:r>
+              <w:rPr>
+                <w:rFonts w:ascii="Calibri" w:eastAsia="Times New Roman" w:hAnsi="Calibri" w:cs="Calibri"/>
+                <w:color w:val="000000"/>
+                <w:kern w:val="0"/>
+                <w:sz w:val="22"/>
+                <w:szCs w:val="22"/>
+                <w14:ligatures w14:val="none"/>
+              </w:rPr>
+              <w:t>26</w:t>
+            </w:r>
+          </w:p>
+        </w:tc>
+        <w:tc>
+          <w:tcPr>
+            <w:tcW w:w="900" w:type="dxa"/>
+            <w:shd w:val="clear" w:color="auto" w:fill="auto"/>
+            <w:vAlign w:val="center"/>
+            <w:hideMark/>
+          </w:tcPr>
+          <w:p>
+            <w:pPr>
+              <w:jc w:val="center"/>
+              <w:rPr>
+                <w:rFonts w:ascii="Calibri" w:eastAsia="Times New Roman" w:hAnsi="Calibri" w:cs="Calibri"/>
+                <w:color w:val="000000"/>
+                <w:kern w:val="0"/>
+                <w:sz w:val="22"/>
+                <w:szCs w:val="22"/>
+                <w14:ligatures w14:val="none"/>
+              </w:rPr>
+            </w:pPr>
+            <w:r>
+              <w:rPr>
+                <w:rFonts w:ascii="Calibri" w:eastAsia="Times New Roman" w:hAnsi="Calibri" w:cs="Calibri"/>
+                <w:color w:val="000000"/>
+                <w:kern w:val="0"/>
+                <w:sz w:val="22"/>
+                <w:szCs w:val="22"/>
+                <w14:ligatures w14:val="none"/>
+              </w:rPr>
+              <w:t>26</w:t>
+            </w:r>
+          </w:p>
+        </w:tc>
+        <w:tc>
+          <w:tcPr>
+            <w:tcW w:w="960" w:type="dxa"/>
+            <w:shd w:val="clear" w:color="auto" w:fill="auto"/>
+            <w:vAlign w:val="center"/>
+            <w:hideMark/>
+          </w:tcPr>
+          <w:p>
+            <w:pPr>
+              <w:jc w:val="center"/>
+              <w:rPr>
+                <w:rFonts w:ascii="Calibri" w:eastAsia="Times New Roman" w:hAnsi="Calibri" w:cs="Calibri"/>
+                <w:color w:val="000000"/>
+                <w:kern w:val="0"/>
+                <w:sz w:val="22"/>
+                <w:szCs w:val="22"/>
+                <w14:ligatures w14:val="none"/>
+              </w:rPr>
+            </w:pPr>
+            <w:r>
+              <w:rPr>
+                <w:rFonts w:ascii="Calibri" w:eastAsia="Times New Roman" w:hAnsi="Calibri" w:cs="Calibri"/>
+                <w:color w:val="000000"/>
+                <w:kern w:val="0"/>
+                <w:sz w:val="22"/>
+                <w:szCs w:val="22"/>
+                <w14:ligatures w14:val="none"/>
+              </w:rPr>
+              <w:t>26</w:t>
+            </w:r>
+          </w:p>
+        </w:tc>
+        <w:tc>
+          <w:tcPr>
+            <w:tcW w:w="960" w:type="dxa"/>
+            <w:shd w:val="clear" w:color="auto" w:fill="auto"/>
+            <w:vAlign w:val="center"/>
+            <w:hideMark/>
+          </w:tcPr>
+          <w:p>
+            <w:pPr>
+              <w:jc w:val="center"/>
+              <w:rPr>
+                <w:rFonts w:ascii="Calibri" w:eastAsia="Times New Roman" w:hAnsi="Calibri" w:cs="Calibri"/>
+                <w:color w:val="000000"/>
+                <w:kern w:val="0"/>
+                <w:sz w:val="22"/>
+                <w:szCs w:val="22"/>
+                <w14:ligatures w14:val="none"/>
+              </w:rPr>
+            </w:pPr>
+            <w:r>
+              <w:rPr>
+                <w:rFonts w:ascii="Calibri" w:eastAsia="Times New Roman" w:hAnsi="Calibri" w:cs="Calibri"/>
+                <w:color w:val="000000"/>
+                <w:kern w:val="0"/>
+                <w:sz w:val="22"/>
+                <w:szCs w:val="22"/>
+                <w14:ligatures w14:val="none"/>
+              </w:rPr>
+              <w:t>26</w:t>
+            </w:r>
+          </w:p>
+        </w:tc>
+      </w:tr>
+      <w:tr>
+        <w:trPr>
+          <w:trHeight w:val="288"/>
+          <w:jc w:val="center"/>
+        </w:trPr>
+        <w:tc>
+          <w:tcPr>
+            <w:tcW w:w="2020" w:type="dxa"/>
+            <w:shd w:val="clear" w:color="auto" w:fill="auto"/>
+            <w:vAlign w:val="center"/>
+            <w:hideMark/>
+          </w:tcPr>
+          <w:p>
+            <w:pPr>
+              <w:rPr>
+                <w:rFonts w:ascii="Calibri" w:eastAsia="Times New Roman" w:hAnsi="Calibri" w:cs="Calibri"/>
+                <w:color w:val="000000"/>
+                <w:kern w:val="0"/>
+                <w:sz w:val="22"/>
+                <w:szCs w:val="22"/>
+                <w14:ligatures w14:val="none"/>
+              </w:rPr>
+            </w:pPr>
+            <w:r>
+              <w:rPr>
+                <w:rFonts w:ascii="Calibri" w:eastAsia="Times New Roman" w:hAnsi="Calibri" w:cs="Calibri"/>
+                <w:color w:val="000000"/>
+                <w:kern w:val="0"/>
+                <w:sz w:val="22"/>
+                <w:szCs w:val="22"/>
+                <w14:ligatures w14:val="none"/>
               </w:rPr>
               <w:t>Observations</w:t>
             </w:r>
@@ -12635,115 +13117,130 @@
         </w:tc>
         <w:tc>
           <w:tcPr>
-            <w:tcW w:w="1523" w:type="dxa"/>
-            <w:tcBorders>
-              <w:bottom w:val="single" w:sz="4" w:space="0" w:color="auto"/>
-            </w:tcBorders>
+            <w:tcW w:w="1300" w:type="dxa"/>
+            <w:shd w:val="clear" w:color="auto" w:fill="auto"/>
+            <w:vAlign w:val="center"/>
+            <w:hideMark/>
           </w:tcPr>
           <w:p>
             <w:pPr>
               <w:jc w:val="center"/>
               <w:rPr>
-                <w:rFonts w:ascii="Times New Roman" w:hAnsi="Times New Roman" w:cs="Times New Roman"/>
-                <w:noProof/>
+                <w:rFonts w:ascii="Calibri" w:eastAsia="Times New Roman" w:hAnsi="Calibri" w:cs="Calibri"/>
+                <w:color w:val="000000"/>
+                <w:kern w:val="0"/>
+                <w:sz w:val="22"/>
+                <w:szCs w:val="22"/>
+                <w14:ligatures w14:val="none"/>
               </w:rPr>
             </w:pPr>
             <w:r>
               <w:rPr>
-                <w:rFonts w:ascii="Times New Roman" w:hAnsi="Times New Roman" w:cs="Times New Roman"/>
-                <w:noProof/>
-              </w:rPr>
-              <w:t>52*10=450</w:t>
+                <w:rFonts w:ascii="Calibri" w:eastAsia="Times New Roman" w:hAnsi="Calibri" w:cs="Calibri"/>
+                <w:color w:val="000000"/>
+                <w:kern w:val="0"/>
+                <w:sz w:val="22"/>
+                <w:szCs w:val="22"/>
+                <w14:ligatures w14:val="none"/>
+              </w:rPr>
+              <w:t>450</w:t>
             </w:r>
           </w:p>
         </w:tc>
         <w:tc>
           <w:tcPr>
-            <w:tcW w:w="1312" w:type="dxa"/>
-            <w:tcBorders>
-              <w:bottom w:val="single" w:sz="4" w:space="0" w:color="auto"/>
-            </w:tcBorders>
+            <w:tcW w:w="900" w:type="dxa"/>
+            <w:shd w:val="clear" w:color="auto" w:fill="auto"/>
+            <w:vAlign w:val="center"/>
+            <w:hideMark/>
           </w:tcPr>
           <w:p>
             <w:pPr>
               <w:jc w:val="center"/>
               <w:rPr>
-                <w:rFonts w:ascii="Times New Roman" w:hAnsi="Times New Roman" w:cs="Times New Roman"/>
-                <w:noProof/>
+                <w:rFonts w:ascii="Calibri" w:eastAsia="Times New Roman" w:hAnsi="Calibri" w:cs="Calibri"/>
+                <w:color w:val="000000"/>
+                <w:kern w:val="0"/>
+                <w:sz w:val="22"/>
+                <w:szCs w:val="22"/>
+                <w14:ligatures w14:val="none"/>
               </w:rPr>
             </w:pPr>
             <w:r>
               <w:rPr>
-                <w:rFonts w:ascii="Times New Roman" w:hAnsi="Times New Roman" w:cs="Times New Roman"/>
-                <w:noProof/>
-              </w:rPr>
-              <w:t>40*10=400</w:t>
+                <w:rFonts w:ascii="Calibri" w:eastAsia="Times New Roman" w:hAnsi="Calibri" w:cs="Calibri"/>
+                <w:color w:val="000000"/>
+                <w:kern w:val="0"/>
+                <w:sz w:val="22"/>
+                <w:szCs w:val="22"/>
+                <w14:ligatures w14:val="none"/>
+              </w:rPr>
+              <w:t>400</w:t>
             </w:r>
           </w:p>
         </w:tc>
         <w:tc>
           <w:tcPr>
-            <w:tcW w:w="1312" w:type="dxa"/>
-            <w:tcBorders>
-              <w:bottom w:val="single" w:sz="4" w:space="0" w:color="auto"/>
-            </w:tcBorders>
+            <w:tcW w:w="960" w:type="dxa"/>
+            <w:shd w:val="clear" w:color="auto" w:fill="auto"/>
+            <w:vAlign w:val="center"/>
+            <w:hideMark/>
           </w:tcPr>
           <w:p>
             <w:pPr>
               <w:jc w:val="center"/>
               <w:rPr>
-                <w:rFonts w:ascii="Times New Roman" w:hAnsi="Times New Roman" w:cs="Times New Roman"/>
-                <w:noProof/>
+                <w:rFonts w:ascii="Calibri" w:eastAsia="Times New Roman" w:hAnsi="Calibri" w:cs="Calibri"/>
+                <w:color w:val="000000"/>
+                <w:kern w:val="0"/>
+                <w:sz w:val="22"/>
+                <w:szCs w:val="22"/>
+                <w14:ligatures w14:val="none"/>
               </w:rPr>
             </w:pPr>
             <w:r>
               <w:rPr>
-                <w:rFonts w:ascii="Times New Roman" w:hAnsi="Times New Roman" w:cs="Times New Roman"/>
-                <w:noProof/>
-              </w:rPr>
-              <w:t>39*10=390</w:t>
+                <w:rFonts w:ascii="Calibri" w:eastAsia="Times New Roman" w:hAnsi="Calibri" w:cs="Calibri"/>
+                <w:color w:val="000000"/>
+                <w:kern w:val="0"/>
+                <w:sz w:val="22"/>
+                <w:szCs w:val="22"/>
+                <w14:ligatures w14:val="none"/>
+              </w:rPr>
+              <w:t>390</w:t>
             </w:r>
           </w:p>
         </w:tc>
         <w:tc>
           <w:tcPr>
-            <w:tcW w:w="1672" w:type="dxa"/>
-            <w:tcBorders>
-              <w:bottom w:val="single" w:sz="4" w:space="0" w:color="auto"/>
-            </w:tcBorders>
+            <w:tcW w:w="960" w:type="dxa"/>
+            <w:shd w:val="clear" w:color="auto" w:fill="auto"/>
+            <w:vAlign w:val="center"/>
+            <w:hideMark/>
           </w:tcPr>
           <w:p>
             <w:pPr>
               <w:jc w:val="center"/>
               <w:rPr>
-                <w:rFonts w:ascii="Times New Roman" w:hAnsi="Times New Roman" w:cs="Times New Roman"/>
-                <w:noProof/>
+                <w:rFonts w:ascii="Calibri" w:eastAsia="Times New Roman" w:hAnsi="Calibri" w:cs="Calibri"/>
+                <w:color w:val="000000"/>
+                <w:kern w:val="0"/>
+                <w:sz w:val="22"/>
+                <w:szCs w:val="22"/>
+                <w14:ligatures w14:val="none"/>
               </w:rPr>
             </w:pPr>
             <w:r>
               <w:rPr>
-                <w:rFonts w:ascii="Times New Roman" w:hAnsi="Times New Roman" w:cs="Times New Roman"/>
-                <w:noProof/>
-              </w:rPr>
-              <w:t>40*10=400</w:t>
+                <w:rFonts w:ascii="Calibri" w:eastAsia="Times New Roman" w:hAnsi="Calibri" w:cs="Calibri"/>
+                <w:color w:val="000000"/>
+                <w:kern w:val="0"/>
+                <w:sz w:val="22"/>
+                <w:szCs w:val="22"/>
+                <w14:ligatures w14:val="none"/>
+              </w:rPr>
+              <w:t>400</w:t>
             </w:r>
-          </w:p>
-        </w:tc>
-        <w:tc>
-          <w:tcPr>
-            <w:tcW w:w="1590" w:type="dxa"/>
-            <w:tcBorders>
-              <w:bottom w:val="single" w:sz="4" w:space="0" w:color="auto"/>
-            </w:tcBorders>
-          </w:tcPr>
-          <w:p>
-            <w:pPr>
-              <w:jc w:val="center"/>
-              <w:rPr>
-                <w:rFonts w:ascii="Times New Roman" w:hAnsi="Times New Roman" w:cs="Times New Roman"/>
-                <w:noProof/>
-              </w:rPr>
-            </w:pPr>
           </w:p>
         </w:tc>
       </w:tr>
@@ -13212,7 +13709,19 @@
           <w:sz w:val="24"/>
           <w:szCs w:val="24"/>
         </w:rPr>
-        <w:t>Given the inclusion of country and year fixed effects, such a confounder appears implausibly strong.</w:t>
+        <w:t xml:space="preserve">Given the </w:t>
+      </w:r>
+      <w:r>
+        <w:rPr>
+          <w:rFonts w:ascii="Times New Roman" w:hAnsi="Times New Roman" w:cs="Times New Roman"/>
+          <w:i w:val="0"/>
+          <w:iCs w:val="0"/>
+          <w:color w:val="auto"/>
+          <w:sz w:val="24"/>
+          <w:szCs w:val="24"/>
+        </w:rPr>
+        <w:lastRenderedPageBreak/>
+        <w:t>inclusion of country and year fixed effects, such a confounder appears implausibly strong.</w:t>
       </w:r>
       <w:r>
         <w:rPr>
@@ -13556,7 +14065,6 @@
           <w:kern w:val="0"/>
           <w14:ligatures w14:val="none"/>
         </w:rPr>
-        <w:lastRenderedPageBreak/>
         <w:t>A natural interpretation of the results is that students from lower-income EU countries exhibit more elastic demand for UK higher education. However, this interpretation relies on the assumption that the tuition reform generated the same effective price change across countries.</w:t>
       </w:r>
       <w:r>
@@ -13619,7 +14127,16 @@
           <w:kern w:val="0"/>
           <w14:ligatures w14:val="none"/>
         </w:rPr>
-        <w:t xml:space="preserve">and map it across a range of starting income levels (Figure X). When the loan is expected to have a low present value (e.g., for applicants with low expected earnings), the Brexit reform constitutes a large effective price shock, and the implied elasticity is mechanically smaller in magnitude (approximately −0.4). Conversely, when the loan’s present value approaches its nominal amount (high expected earnings), the effective price shock is smaller, and the implied elasticity is larger in magnitude </w:t>
+        <w:t xml:space="preserve">and map it across a range of starting </w:t>
+      </w:r>
+      <w:r>
+        <w:rPr>
+          <w:rFonts w:ascii="Times New Roman" w:eastAsia="Times New Roman" w:hAnsi="Times New Roman" w:cs="Times New Roman"/>
+          <w:kern w:val="0"/>
+          <w14:ligatures w14:val="none"/>
+        </w:rPr>
+        <w:lastRenderedPageBreak/>
+        <w:t xml:space="preserve">income levels (Figure X). When the loan is expected to have a low present value (e.g., for applicants with low expected earnings), the Brexit reform constitutes a large effective price shock, and the implied elasticity is mechanically smaller in magnitude (approximately −0.4). Conversely, when the loan’s present value approaches its nominal amount (high expected earnings), the effective price shock is smaller, and the implied elasticity is larger in magnitude </w:t>
       </w:r>
     </w:p>
     <w:p>
@@ -14043,7 +14560,7 @@
           <w:kern w:val="0"/>
           <w14:ligatures w14:val="none"/>
         </w:rPr>
-        <w:t xml:space="preserve">therefore reflects structural </w:t>
+        <w:t>therefore reflects structural heterogeneity in willingness to pay rather than loan-valuation mechanics.</w:t>
       </w:r>
       <w:r>
         <w:rPr>
@@ -14051,8 +14568,7 @@
           <w:kern w:val="0"/>
           <w14:ligatures w14:val="none"/>
         </w:rPr>
-        <w:lastRenderedPageBreak/>
-        <w:t>heterogeneity in willingness to pay rather than loan-valuation mechanics.</w:t>
+        <w:t xml:space="preserve"> </w:t>
       </w:r>
       <w:r>
         <w:rPr>
@@ -14060,14 +14576,6 @@
           <w:kern w:val="0"/>
           <w14:ligatures w14:val="none"/>
         </w:rPr>
-        <w:t xml:space="preserve"> </w:t>
-      </w:r>
-      <w:r>
-        <w:rPr>
-          <w:rFonts w:ascii="Times New Roman" w:eastAsia="Times New Roman" w:hAnsi="Times New Roman" w:cs="Times New Roman"/>
-          <w:kern w:val="0"/>
-          <w14:ligatures w14:val="none"/>
-        </w:rPr>
         <w:t xml:space="preserve">After recomputing the elasticities heterogenous price changes across the Union we re-estimated the correlation with GDP per capita. Figure 12 shows that this time the same correlation was completely reversed becoming negative.  </w:t>
       </w:r>
     </w:p>
@@ -14087,6 +14595,7 @@
           <w:b/>
           <w:color w:val="000000" w:themeColor="text1"/>
         </w:rPr>
+        <w:lastRenderedPageBreak/>
         <w:t xml:space="preserve">Figure </w:t>
       </w:r>
       <w:r>
@@ -14316,14 +14825,7 @@
         <w:rPr>
           <w:rFonts w:ascii="Times New Roman" w:hAnsi="Times New Roman" w:cs="Times New Roman"/>
         </w:rPr>
-        <w:t xml:space="preserve">applicants from lower-income countries face fewer high-quality domestic alternatives and may view UK education as a </w:t>
-      </w:r>
-      <w:r>
-        <w:rPr>
-          <w:rFonts w:ascii="Times New Roman" w:hAnsi="Times New Roman" w:cs="Times New Roman"/>
-        </w:rPr>
-        <w:lastRenderedPageBreak/>
-        <w:t xml:space="preserve">pathway to significantly higher lifetime earnings. As a result, their application behavior may be less responsive to tuition increases than raw demand responses would suggest. </w:t>
+        <w:t xml:space="preserve">applicants from lower-income countries face fewer high-quality domestic alternatives and may view UK education as a pathway to significantly higher lifetime earnings. As a result, their application behavior may be less responsive to tuition increases than raw demand responses would suggest. </w:t>
       </w:r>
     </w:p>
     <w:p>
@@ -14345,7 +14847,14 @@
         <w:rPr>
           <w:rFonts w:ascii="Times New Roman" w:hAnsi="Times New Roman" w:cs="Times New Roman"/>
         </w:rPr>
-        <w:t>he decline in applications from poorer EU countries reflects the withdrawal of an institution that had quietly equalized opportunity across Europe. The UK’s income-contingent loan system meant that students did not need to arrive with wealth; they needed only the expectation of future effort and earnings. When that system disappeared for EU applicants, the effective cost of studying in the UK rose dramatically for those from poorer economies. What appears in the data as “elastic demand” is therefore better understood as the sudden loss of a mechanism that had allowed talent to travel across borders without the constraint of immediate financial means. In that sense, the Brexit tuition reform did not simply reveal price sensitivity</w:t>
+        <w:t xml:space="preserve">he decline in applications from poorer EU countries reflects the withdrawal of an institution that had quietly equalized opportunity across Europe. The UK’s income-contingent loan system meant that students did not need to arrive with </w:t>
+      </w:r>
+      <w:r>
+        <w:rPr>
+          <w:rFonts w:ascii="Times New Roman" w:hAnsi="Times New Roman" w:cs="Times New Roman"/>
+        </w:rPr>
+        <w:lastRenderedPageBreak/>
+        <w:t>wealth; they needed only the expectation of future effort and earnings. When that system disappeared for EU applicants, the effective cost of studying in the UK rose dramatically for those from poorer economies. What appears in the data as “elastic demand” is therefore better understood as the sudden loss of a mechanism that had allowed talent to travel across borders without the constraint of immediate financial means. In that sense, the Brexit tuition reform did not simply reveal price sensitivity</w:t>
       </w:r>
       <w:r>
         <w:rPr>
@@ -14362,8 +14871,101 @@
     </w:p>
     <w:p>
       <w:pPr>
+        <w:pStyle w:val="ListParagraph"/>
+        <w:numPr>
+          <w:ilvl w:val="1"/>
+          <w:numId w:val="35"/>
+        </w:numPr>
+        <w:spacing w:before="240" w:after="240"/>
+        <w:rPr>
+          <w:rFonts w:ascii="Times New Roman" w:hAnsi="Times New Roman" w:cs="Times New Roman"/>
+          <w:b/>
+          <w:i/>
+          <w:noProof/>
+        </w:rPr>
+      </w:pPr>
+      <w:r>
+        <w:rPr>
+          <w:rFonts w:ascii="Times New Roman" w:hAnsi="Times New Roman" w:cs="Times New Roman"/>
+          <w:b/>
+          <w:i/>
+          <w:noProof/>
+        </w:rPr>
+        <w:t xml:space="preserve"> What are the real determinants of</w:t>
+      </w:r>
+      <w:r>
+        <w:rPr>
+          <w:rFonts w:ascii="Times New Roman" w:hAnsi="Times New Roman" w:cs="Times New Roman"/>
+          <w:b/>
+          <w:i/>
+          <w:noProof/>
+        </w:rPr>
+        <w:t xml:space="preserve"> the</w:t>
+      </w:r>
+      <w:bookmarkStart w:id="3" w:name="_GoBack"/>
+      <w:bookmarkEnd w:id="3"/>
+      <w:r>
+        <w:rPr>
+          <w:rFonts w:ascii="Times New Roman" w:hAnsi="Times New Roman" w:cs="Times New Roman"/>
+          <w:b/>
+          <w:i/>
+          <w:noProof/>
+        </w:rPr>
+        <w:t xml:space="preserve"> corrected elasticity?</w:t>
+      </w:r>
+    </w:p>
+    <w:p>
+      <w:pPr>
         <w:spacing w:line="360" w:lineRule="auto"/>
-        <w:ind w:firstLine="720"/>
+        <w:jc w:val="both"/>
+        <w:rPr>
+          <w:rFonts w:ascii="Times New Roman" w:hAnsi="Times New Roman" w:cs="Times New Roman"/>
+        </w:rPr>
+      </w:pPr>
+      <w:r>
+        <w:rPr>
+          <w:rFonts w:ascii="Times New Roman" w:hAnsi="Times New Roman" w:cs="Times New Roman"/>
+        </w:rPr>
+        <w:drawing>
+          <wp:inline distT="0" distB="0" distL="0" distR="0" wp14:anchorId="2D58330F" wp14:editId="758080DD">
+            <wp:extent cx="5985138" cy="3131820"/>
+            <wp:effectExtent l="0" t="0" r="0" b="0"/>
+            <wp:docPr id="6" name="Picture 6"/>
+            <wp:cNvGraphicFramePr>
+              <a:graphicFrameLocks xmlns:a="http://schemas.openxmlformats.org/drawingml/2006/main" noChangeAspect="1"/>
+            </wp:cNvGraphicFramePr>
+            <a:graphic xmlns:a="http://schemas.openxmlformats.org/drawingml/2006/main">
+              <a:graphicData uri="http://schemas.openxmlformats.org/drawingml/2006/picture">
+                <pic:pic xmlns:pic="http://schemas.openxmlformats.org/drawingml/2006/picture">
+                  <pic:nvPicPr>
+                    <pic:cNvPr id="1" name=""/>
+                    <pic:cNvPicPr/>
+                  </pic:nvPicPr>
+                  <pic:blipFill>
+                    <a:blip r:embed="rId20"/>
+                    <a:stretch>
+                      <a:fillRect/>
+                    </a:stretch>
+                  </pic:blipFill>
+                  <pic:spPr>
+                    <a:xfrm>
+                      <a:off x="0" y="0"/>
+                      <a:ext cx="5986828" cy="3132704"/>
+                    </a:xfrm>
+                    <a:prstGeom prst="rect">
+                      <a:avLst/>
+                    </a:prstGeom>
+                  </pic:spPr>
+                </pic:pic>
+              </a:graphicData>
+            </a:graphic>
+          </wp:inline>
+        </w:drawing>
+      </w:r>
+    </w:p>
+    <w:p>
+      <w:pPr>
+        <w:spacing w:line="360" w:lineRule="auto"/>
         <w:jc w:val="both"/>
         <w:rPr>
           <w:rFonts w:ascii="Times New Roman" w:hAnsi="Times New Roman" w:cs="Times New Roman"/>
@@ -18629,7 +19231,6 @@
                 <w:szCs w:val="22"/>
                 <w14:ligatures w14:val="none"/>
               </w:rPr>
-              <w:lastRenderedPageBreak/>
               <w:t>Treated</w:t>
             </w:r>
           </w:p>
@@ -19664,7 +20265,7 @@
                     <pic:cNvPicPr/>
                   </pic:nvPicPr>
                   <pic:blipFill>
-                    <a:blip r:embed="rId20"/>
+                    <a:blip r:embed="rId21"/>
                     <a:stretch>
                       <a:fillRect/>
                     </a:stretch>
@@ -19751,6 +20352,7 @@
           <w:b/>
           <w:bCs/>
         </w:rPr>
+        <w:lastRenderedPageBreak/>
         <w:t xml:space="preserve">Bound, J., </w:t>
       </w:r>
       <w:proofErr w:type="spellStart"/>
@@ -19953,7 +20555,6 @@
           <w:b/>
           <w:bCs/>
         </w:rPr>
-        <w:lastRenderedPageBreak/>
         <w:t>Calhoun, C.</w:t>
       </w:r>
       <w:r>
@@ -20006,7 +20607,7 @@
       <w:r>
         <w:t xml:space="preserve">. Retrieved from </w:t>
       </w:r>
-      <w:hyperlink r:id="rId21" w:tgtFrame="_new" w:history="1">
+      <w:hyperlink r:id="rId22" w:tgtFrame="_new" w:history="1">
         <w:r>
           <w:rPr>
             <w:rStyle w:val="Hyperlink"/>
@@ -20058,7 +20659,7 @@
       <w:r>
         <w:t xml:space="preserve">(4), 291–318. </w:t>
       </w:r>
-      <w:hyperlink r:id="rId22" w:tgtFrame="_new" w:history="1">
+      <w:hyperlink r:id="rId23" w:tgtFrame="_new" w:history="1">
         <w:r>
           <w:rPr>
             <w:rStyle w:val="Hyperlink"/>
@@ -20103,7 +20704,7 @@
       <w:r>
         <w:t xml:space="preserve"> (Vol. 21). Springer, Singapore. </w:t>
       </w:r>
-      <w:hyperlink r:id="rId23" w:tgtFrame="_new" w:history="1">
+      <w:hyperlink r:id="rId24" w:tgtFrame="_new" w:history="1">
         <w:r>
           <w:rPr>
             <w:rStyle w:val="Hyperlink"/>
@@ -20129,7 +20730,7 @@
       <w:r>
         <w:t xml:space="preserve"> (2020). Mitigating the hostile environment: The role of the workplace in EU migrant experience of Brexit. Journal of Ethnic and Migration Studies, 47(1), 190–207. </w:t>
       </w:r>
-      <w:hyperlink r:id="rId24" w:history="1">
+      <w:hyperlink r:id="rId25" w:history="1">
         <w:r>
           <w:rPr>
             <w:rStyle w:val="Hyperlink"/>
@@ -20168,7 +20769,7 @@
       <w:r>
         <w:t xml:space="preserve">(2), 249–258. </w:t>
       </w:r>
-      <w:hyperlink r:id="rId25" w:tgtFrame="_new" w:history="1">
+      <w:hyperlink r:id="rId26" w:tgtFrame="_new" w:history="1">
         <w:r>
           <w:rPr>
             <w:rStyle w:val="Hyperlink"/>
@@ -20240,7 +20841,7 @@
       <w:r>
         <w:t xml:space="preserve">(4), 149–169. </w:t>
       </w:r>
-      <w:hyperlink r:id="rId26" w:tgtFrame="_new" w:history="1">
+      <w:hyperlink r:id="rId27" w:tgtFrame="_new" w:history="1">
         <w:r>
           <w:rPr>
             <w:rStyle w:val="Hyperlink"/>
@@ -20276,7 +20877,7 @@
       <w:r>
         <w:t xml:space="preserve">(3), 329–347. </w:t>
       </w:r>
-      <w:hyperlink r:id="rId27" w:tgtFrame="_new" w:history="1">
+      <w:hyperlink r:id="rId28" w:tgtFrame="_new" w:history="1">
         <w:r>
           <w:rPr>
             <w:rStyle w:val="Hyperlink"/>
@@ -20312,7 +20913,7 @@
       <w:r>
         <w:t xml:space="preserve">(1), 179–187. </w:t>
       </w:r>
-      <w:hyperlink r:id="rId28" w:tgtFrame="_new" w:history="1">
+      <w:hyperlink r:id="rId29" w:tgtFrame="_new" w:history="1">
         <w:r>
           <w:rPr>
             <w:rStyle w:val="Hyperlink"/>
@@ -20350,7 +20951,7 @@
       <w:r>
         <w:t xml:space="preserve"> (1998), ‘Consistent covariance matrix estimation with spatially dependent panel data’, Review of Economics and Statistics, Vol. 80, No. 4, pp. 549–560. </w:t>
       </w:r>
-      <w:hyperlink r:id="rId29" w:history="1">
+      <w:hyperlink r:id="rId30" w:history="1">
         <w:r>
           <w:rPr>
             <w:rStyle w:val="Hyperlink"/>
@@ -20386,7 +20987,7 @@
       <w:r>
         <w:t xml:space="preserve">. GOV.UK. </w:t>
       </w:r>
-      <w:hyperlink r:id="rId30" w:tgtFrame="_new" w:history="1">
+      <w:hyperlink r:id="rId31" w:tgtFrame="_new" w:history="1">
         <w:r>
           <w:rPr>
             <w:rStyle w:val="Hyperlink"/>
@@ -20444,7 +21045,7 @@
       <w:r>
         <w:t xml:space="preserve">. GOV.UK. </w:t>
       </w:r>
-      <w:hyperlink r:id="rId31" w:tgtFrame="_new" w:history="1">
+      <w:hyperlink r:id="rId32" w:tgtFrame="_new" w:history="1">
         <w:r>
           <w:rPr>
             <w:rStyle w:val="Hyperlink"/>
@@ -20459,6 +21060,7 @@
         <w:jc w:val="both"/>
         <w:rPr>
           <w:rFonts w:ascii="Times New Roman" w:hAnsi="Times New Roman" w:cs="Times New Roman"/>
+          <w:iCs/>
         </w:rPr>
       </w:pPr>
       <w:r>
@@ -20467,6 +21069,7 @@
           <w:b/>
           <w:iCs/>
         </w:rPr>
+        <w:lastRenderedPageBreak/>
         <w:t>Berge, Laurent</w:t>
       </w:r>
       <w:r>
@@ -20530,6 +21133,44 @@
         </w:rPr>
         <w:t>." CREA Discussion Papers, 13.</w:t>
       </w:r>
+    </w:p>
+    <w:p>
+      <w:pPr>
+        <w:ind w:left="709" w:hanging="709"/>
+        <w:jc w:val="both"/>
+        <w:rPr>
+          <w:rFonts w:ascii="Times New Roman" w:hAnsi="Times New Roman" w:cs="Times New Roman"/>
+        </w:rPr>
+      </w:pPr>
+      <w:r>
+        <w:rPr>
+          <w:rFonts w:ascii="Times New Roman" w:hAnsi="Times New Roman" w:cs="Times New Roman"/>
+        </w:rPr>
+        <w:t>UCAS. (2022). </w:t>
+      </w:r>
+      <w:r>
+        <w:rPr>
+          <w:rFonts w:ascii="Times New Roman" w:hAnsi="Times New Roman" w:cs="Times New Roman"/>
+          <w:i/>
+          <w:iCs/>
+        </w:rPr>
+        <w:t>UCAS undergraduate sector-level end of cycle data resources 2021</w:t>
+      </w:r>
+      <w:r>
+        <w:rPr>
+          <w:rFonts w:ascii="Times New Roman" w:hAnsi="Times New Roman" w:cs="Times New Roman"/>
+        </w:rPr>
+        <w:t>. </w:t>
+      </w:r>
+      <w:hyperlink r:id="rId33" w:tgtFrame="_new" w:history="1">
+        <w:r>
+          <w:rPr>
+            <w:rStyle w:val="Hyperlink"/>
+            <w:rFonts w:ascii="Times New Roman" w:hAnsi="Times New Roman" w:cs="Times New Roman"/>
+          </w:rPr>
+          <w:t>https://www.ucas.com/data-and-analysis/undergraduate-statistics-and-reports/ucas-undergraduate-sector-level-end-of-cycle-data-resources-2021</w:t>
+        </w:r>
+      </w:hyperlink>
     </w:p>
     <w:sectPr>
       <w:pgSz w:w="11906" w:h="16838"/>
@@ -20573,6 +21214,149 @@
     <w:p>
       <w:r>
         <w:continuationSeparator/>
+      </w:r>
+    </w:p>
+  </w:footnote>
+  <w:footnote w:id="1">
+    <w:p>
+      <w:pPr>
+        <w:pStyle w:val="FootnoteText"/>
+        <w:jc w:val="both"/>
+      </w:pPr>
+      <w:r>
+        <w:rPr>
+          <w:rStyle w:val="FootnoteReference"/>
+        </w:rPr>
+        <w:footnoteRef/>
+      </w:r>
+      <w:r>
+        <w:t xml:space="preserve"> Note that the elasticities produced under the two-ways and one way-estimators are going to have a perfectly collinear relationship. The only difference will be in the constant (the shift factor). Note that the TWFE estimator is defined as  </w:t>
+      </w:r>
+      <m:oMath>
+        <m:sSubSup>
+          <m:sSubSupPr>
+            <m:ctrlPr>
+              <w:rPr>
+                <w:rFonts w:ascii="Cambria Math" w:hAnsi="Cambria Math"/>
+                <w:i/>
+              </w:rPr>
+            </m:ctrlPr>
+          </m:sSubSupPr>
+          <m:e>
+            <m:acc>
+              <m:accPr>
+                <m:ctrlPr>
+                  <w:rPr>
+                    <w:rFonts w:ascii="Cambria Math" w:hAnsi="Cambria Math"/>
+                    <w:i/>
+                  </w:rPr>
+                </m:ctrlPr>
+              </m:accPr>
+              <m:e>
+                <m:r>
+                  <w:rPr>
+                    <w:rFonts w:ascii="Cambria Math" w:hAnsi="Cambria Math"/>
+                  </w:rPr>
+                  <m:t>β</m:t>
+                </m:r>
+              </m:e>
+            </m:acc>
+          </m:e>
+          <m:sub>
+            <m:r>
+              <w:rPr>
+                <w:rFonts w:ascii="Cambria Math" w:hAnsi="Cambria Math"/>
+              </w:rPr>
+              <m:t>i</m:t>
+            </m:r>
+          </m:sub>
+          <m:sup>
+            <m:r>
+              <w:rPr>
+                <w:rFonts w:ascii="Cambria Math" w:hAnsi="Cambria Math"/>
+              </w:rPr>
+              <m:t>TWFE</m:t>
+            </m:r>
+          </m:sup>
+        </m:sSubSup>
+        <m:r>
+          <w:rPr>
+            <w:rFonts w:ascii="Cambria Math" w:hAnsi="Cambria Math"/>
+          </w:rPr>
+          <m:t>=</m:t>
+        </m:r>
+        <m:sSubSup>
+          <m:sSubSupPr>
+            <m:ctrlPr>
+              <w:rPr>
+                <w:rFonts w:ascii="Cambria Math" w:hAnsi="Cambria Math"/>
+                <w:i/>
+              </w:rPr>
+            </m:ctrlPr>
+          </m:sSubSupPr>
+          <m:e>
+            <m:acc>
+              <m:accPr>
+                <m:ctrlPr>
+                  <w:rPr>
+                    <w:rFonts w:ascii="Cambria Math" w:hAnsi="Cambria Math"/>
+                    <w:i/>
+                  </w:rPr>
+                </m:ctrlPr>
+              </m:accPr>
+              <m:e>
+                <m:r>
+                  <w:rPr>
+                    <w:rFonts w:ascii="Cambria Math" w:hAnsi="Cambria Math"/>
+                  </w:rPr>
+                  <m:t>β</m:t>
+                </m:r>
+              </m:e>
+            </m:acc>
+          </m:e>
+          <m:sub>
+            <m:r>
+              <w:rPr>
+                <w:rFonts w:ascii="Cambria Math" w:hAnsi="Cambria Math"/>
+              </w:rPr>
+              <m:t>i</m:t>
+            </m:r>
+          </m:sub>
+          <m:sup>
+            <m:r>
+              <w:rPr>
+                <w:rFonts w:ascii="Cambria Math" w:hAnsi="Cambria Math"/>
+              </w:rPr>
+              <m:t>OWFE</m:t>
+            </m:r>
+          </m:sup>
+        </m:sSubSup>
+        <m:r>
+          <w:rPr>
+            <w:rFonts w:ascii="Cambria Math" w:hAnsi="Cambria Math"/>
+          </w:rPr>
+          <m:t>-c</m:t>
+        </m:r>
+      </m:oMath>
+      <w:r>
+        <w:rPr>
+          <w:rFonts w:eastAsiaTheme="minorEastAsia"/>
+        </w:rPr>
+        <w:t xml:space="preserve"> where </w:t>
+      </w:r>
+      <m:oMath>
+        <m:r>
+          <w:rPr>
+            <w:rFonts w:ascii="Cambria Math" w:eastAsiaTheme="minorEastAsia" w:hAnsi="Cambria Math"/>
+          </w:rPr>
+          <m:t>c</m:t>
+        </m:r>
+      </m:oMath>
+      <w:r>
+        <w:rPr>
+          <w:rFonts w:eastAsiaTheme="minorEastAsia"/>
+        </w:rPr>
+        <w:t xml:space="preserve"> is a constant and denotes the average time effect and will be absorbed the shift factor In the OLS cross-section.  </w:t>
       </w:r>
     </w:p>
   </w:footnote>
@@ -26420,7 +27204,7 @@
 </file>
 
 <file path=customXml/itemProps1.xml><?xml version="1.0" encoding="utf-8"?>
-<ds:datastoreItem xmlns:ds="http://schemas.openxmlformats.org/officeDocument/2006/customXml" ds:itemID="{18629C67-755E-4B59-9E52-039B57AAD920}">
+<ds:datastoreItem xmlns:ds="http://schemas.openxmlformats.org/officeDocument/2006/customXml" ds:itemID="{6A1FC058-C7DB-44BB-921C-1D7644474E21}">
   <ds:schemaRefs>
     <ds:schemaRef ds:uri="http://schemas.openxmlformats.org/officeDocument/2006/bibliography"/>
   </ds:schemaRefs>

</xml_diff>